<commit_message>
Update courseware: platform guides, AI-codes paradigm shift, agentic AI definitions, software install guide
Learner Guide, slides, Lesson Plan, public Facilitator Guide and lab manuals
rebuilt; README links the course trading simulator.

Co-Authored-By: Claude Opus 5.5 <noreply@anthropic.com>
</commit_message>
<xml_diff>
--- a/courseware/Facilitator-Guide_ML 101 for Financial Trading_v2.0.docx
+++ b/courseware/Facilitator-Guide_ML 101 for Financial Trading_v2.0.docx
@@ -2380,7 +2380,7 @@
                 <w:color w:val="444A54"/>
                 <w:sz w:val="17"/>
               </w:rPr>
-              <w:t>1-23</w:t>
+              <w:t>1-27</w:t>
             </w:r>
           </w:p>
         </w:tc>
@@ -2510,7 +2510,7 @@
                 <w:color w:val="444A54"/>
                 <w:sz w:val="17"/>
               </w:rPr>
-              <w:t>25-53</w:t>
+              <w:t>29-57</w:t>
             </w:r>
           </w:p>
         </w:tc>
@@ -2772,7 +2772,7 @@
                 <w:color w:val="444A54"/>
                 <w:sz w:val="17"/>
               </w:rPr>
-              <w:t>25-53</w:t>
+              <w:t>29-57</w:t>
             </w:r>
           </w:p>
         </w:tc>
@@ -2908,7 +2908,7 @@
                 <w:color w:val="444A54"/>
                 <w:sz w:val="17"/>
               </w:rPr>
-              <w:t>54</w:t>
+              <w:t>58</w:t>
             </w:r>
           </w:p>
         </w:tc>
@@ -3038,7 +3038,7 @@
                 <w:color w:val="444A54"/>
                 <w:sz w:val="17"/>
               </w:rPr>
-              <w:t>55</w:t>
+              <w:t>59</w:t>
             </w:r>
           </w:p>
         </w:tc>
@@ -3174,7 +3174,7 @@
                 <w:color w:val="444A54"/>
                 <w:sz w:val="17"/>
               </w:rPr>
-              <w:t>57</w:t>
+              <w:t>61</w:t>
             </w:r>
           </w:p>
         </w:tc>
@@ -3436,7 +3436,7 @@
                 <w:color w:val="444A54"/>
                 <w:sz w:val="17"/>
               </w:rPr>
-              <w:t>60</w:t>
+              <w:t>64</w:t>
             </w:r>
           </w:p>
         </w:tc>
@@ -3566,7 +3566,7 @@
                 <w:color w:val="444A54"/>
                 <w:sz w:val="17"/>
               </w:rPr>
-              <w:t>64-85</w:t>
+              <w:t>68-92</w:t>
             </w:r>
           </w:p>
         </w:tc>
@@ -3702,7 +3702,7 @@
                 <w:color w:val="444A54"/>
                 <w:sz w:val="17"/>
               </w:rPr>
-              <w:t>86</w:t>
+              <w:t>93</w:t>
             </w:r>
           </w:p>
         </w:tc>
@@ -3832,7 +3832,7 @@
                 <w:color w:val="444A54"/>
                 <w:sz w:val="17"/>
               </w:rPr>
-              <w:t>88</w:t>
+              <w:t>95</w:t>
             </w:r>
           </w:p>
         </w:tc>
@@ -4094,7 +4094,7 @@
                 <w:color w:val="444A54"/>
                 <w:sz w:val="17"/>
               </w:rPr>
-              <w:t>91</w:t>
+              <w:t>98</w:t>
             </w:r>
           </w:p>
         </w:tc>
@@ -4230,7 +4230,7 @@
                 <w:color w:val="444A54"/>
                 <w:sz w:val="17"/>
               </w:rPr>
-              <w:t>64-85</w:t>
+              <w:t>68-92</w:t>
             </w:r>
           </w:p>
         </w:tc>
@@ -4360,7 +4360,7 @@
                 <w:color w:val="444A54"/>
                 <w:sz w:val="17"/>
               </w:rPr>
-              <w:t>93</w:t>
+              <w:t>100</w:t>
             </w:r>
           </w:p>
         </w:tc>
@@ -4496,7 +4496,7 @@
                 <w:color w:val="444A54"/>
                 <w:sz w:val="17"/>
               </w:rPr>
-              <w:t>64-85</w:t>
+              <w:t>68-92</w:t>
             </w:r>
           </w:p>
         </w:tc>
@@ -4626,7 +4626,7 @@
                 <w:color w:val="444A54"/>
                 <w:sz w:val="17"/>
               </w:rPr>
-              <w:t>94</w:t>
+              <w:t>101</w:t>
             </w:r>
           </w:p>
         </w:tc>
@@ -5077,7 +5077,7 @@
                 <w:color w:val="444A54"/>
                 <w:sz w:val="17"/>
               </w:rPr>
-              <w:t>1-23</w:t>
+              <w:t>1-27</w:t>
             </w:r>
           </w:p>
         </w:tc>
@@ -5207,7 +5207,7 @@
                 <w:color w:val="444A54"/>
                 <w:sz w:val="17"/>
               </w:rPr>
-              <w:t>99-115</w:t>
+              <w:t>106-122</w:t>
             </w:r>
           </w:p>
         </w:tc>
@@ -5343,7 +5343,7 @@
                 <w:color w:val="444A54"/>
                 <w:sz w:val="17"/>
               </w:rPr>
-              <w:t>116</w:t>
+              <w:t>123</w:t>
             </w:r>
           </w:p>
         </w:tc>
@@ -5473,7 +5473,7 @@
                 <w:color w:val="444A54"/>
                 <w:sz w:val="17"/>
               </w:rPr>
-              <w:t>118</w:t>
+              <w:t>125</w:t>
             </w:r>
           </w:p>
         </w:tc>
@@ -5735,7 +5735,7 @@
                 <w:color w:val="444A54"/>
                 <w:sz w:val="17"/>
               </w:rPr>
-              <w:t>99-115</w:t>
+              <w:t>106-122</w:t>
             </w:r>
           </w:p>
         </w:tc>
@@ -5871,7 +5871,7 @@
                 <w:color w:val="444A54"/>
                 <w:sz w:val="17"/>
               </w:rPr>
-              <w:t>120</w:t>
+              <w:t>127</w:t>
             </w:r>
           </w:p>
         </w:tc>
@@ -6001,7 +6001,7 @@
                 <w:color w:val="444A54"/>
                 <w:sz w:val="17"/>
               </w:rPr>
-              <w:t>99-115</w:t>
+              <w:t>106-122</w:t>
             </w:r>
           </w:p>
         </w:tc>
@@ -6137,7 +6137,7 @@
                 <w:color w:val="444A54"/>
                 <w:sz w:val="17"/>
               </w:rPr>
-              <w:t>122</w:t>
+              <w:t>129</w:t>
             </w:r>
           </w:p>
         </w:tc>
@@ -6267,7 +6267,7 @@
                 <w:color w:val="444A54"/>
                 <w:sz w:val="17"/>
               </w:rPr>
-              <w:t>124</w:t>
+              <w:t>131</w:t>
             </w:r>
           </w:p>
         </w:tc>
@@ -6403,7 +6403,7 @@
                 <w:color w:val="444A54"/>
                 <w:sz w:val="17"/>
               </w:rPr>
-              <w:t>128-135</w:t>
+              <w:t>135-142</w:t>
             </w:r>
           </w:p>
         </w:tc>
@@ -6665,7 +6665,7 @@
                 <w:color w:val="444A54"/>
                 <w:sz w:val="17"/>
               </w:rPr>
-              <w:t>137</w:t>
+              <w:t>144</w:t>
             </w:r>
           </w:p>
         </w:tc>
@@ -6795,7 +6795,7 @@
                 <w:color w:val="444A54"/>
                 <w:sz w:val="17"/>
               </w:rPr>
-              <w:t>128-135</w:t>
+              <w:t>135-142</w:t>
             </w:r>
           </w:p>
         </w:tc>
@@ -6931,7 +6931,7 @@
                 <w:color w:val="444A54"/>
                 <w:sz w:val="17"/>
               </w:rPr>
-              <w:t>139</w:t>
+              <w:t>146</w:t>
             </w:r>
           </w:p>
         </w:tc>
@@ -7061,7 +7061,7 @@
                 <w:color w:val="444A54"/>
                 <w:sz w:val="17"/>
               </w:rPr>
-              <w:t>141</w:t>
+              <w:t>148</w:t>
             </w:r>
           </w:p>
         </w:tc>
@@ -7197,7 +7197,7 @@
                 <w:color w:val="444A54"/>
                 <w:sz w:val="17"/>
               </w:rPr>
-              <w:t>128-135</w:t>
+              <w:t>135-142</w:t>
             </w:r>
           </w:p>
         </w:tc>
@@ -7327,7 +7327,7 @@
                 <w:color w:val="444A54"/>
                 <w:sz w:val="17"/>
               </w:rPr>
-              <w:t>142</w:t>
+              <w:t>149</w:t>
             </w:r>
           </w:p>
         </w:tc>
@@ -7589,7 +7589,7 @@
                 <w:color w:val="444A54"/>
                 <w:sz w:val="17"/>
               </w:rPr>
-              <w:t>128-135</w:t>
+              <w:t>135-142</w:t>
             </w:r>
           </w:p>
         </w:tc>
@@ -7725,7 +7725,7 @@
                 <w:color w:val="444A54"/>
                 <w:sz w:val="17"/>
               </w:rPr>
-              <w:t>144</w:t>
+              <w:t>151</w:t>
             </w:r>
           </w:p>
         </w:tc>
@@ -7855,7 +7855,7 @@
                 <w:color w:val="444A54"/>
                 <w:sz w:val="17"/>
               </w:rPr>
-              <w:t>146</w:t>
+              <w:t>153</w:t>
             </w:r>
           </w:p>
         </w:tc>
@@ -7991,7 +7991,7 @@
                 <w:color w:val="444A54"/>
                 <w:sz w:val="17"/>
               </w:rPr>
-              <w:t>18</w:t>
+              <w:t>20</w:t>
             </w:r>
           </w:p>
         </w:tc>
@@ -8121,7 +8121,7 @@
                 <w:color w:val="444A54"/>
                 <w:sz w:val="17"/>
               </w:rPr>
-              <w:t>18</w:t>
+              <w:t>20</w:t>
             </w:r>
           </w:p>
         </w:tc>
@@ -8185,7 +8185,7 @@
           <w:color w:val="E87122"/>
           <w:sz w:val="19"/>
         </w:rPr>
-        <w:t>Day 1  |  Slides 24-62  |  A1, A6, K1, K9  |  Labs 1-4</w:t>
+        <w:t>Day 1  |  Slides 28-66  |  A1, A6, K1, K9  |  Labs 1-4</w:t>
       </w:r>
     </w:p>
     <w:p>
@@ -8275,7 +8275,7 @@
           <w:color w:val="444A54"/>
           <w:sz w:val="20"/>
         </w:rPr>
-        <w:t>1.4 AI Agents versus Agentic AI in Trading, and Multi-Agent Trading Systems (K1): An AI agent is a single LLM-powered program with tools that performs a bounded trading task on its own - for example a signal bot that fetches a stock's bars and news and replies Buy / Sell / Hold with its reasoning.</w:t>
+        <w:t>1.4 Agentic AI versus AI Agents in Trading, and Multi-Agent Trading Systems (K1): Agentic AI is the capability of AI to plan and act: it calls tools (market-data and broker APIs), uses skills and memory, and follows instructions and guardrails to complete multi-step work when it is asked - for example, an LLM that fetches a stock's bars and news, checks its memory of past trades and proposes an order within its instructions.</w:t>
       </w:r>
     </w:p>
     <w:p>
@@ -8365,6 +8365,21 @@
           <w:color w:val="444A54"/>
           <w:sz w:val="20"/>
         </w:rPr>
+        <w:t>Define agentic AI as the capability (tools, skills, memory, instructions) and an AI agent as its special always-on class that stands by 24/7 (OpenClaw, Hermes Agent, OpenAI Dots).</w:t>
+      </w:r>
+    </w:p>
+    <w:p>
+      <w:pPr>
+        <w:pStyle w:val="ListBullet"/>
+        <w:spacing w:after="60"/>
+        <w:ind w:left="432"/>
+      </w:pPr>
+      <w:r>
+        <w:rPr>
+          <w:rFonts w:ascii="Arial" w:hAnsi="Arial"/>
+          <w:color w:val="444A54"/>
+          <w:sz w:val="20"/>
+        </w:rPr>
         <w:t>On the ML-to-LLM shift, stress the new backtest risk: an LLM may 'know' its training period, so LLM signals must be tested after the knowledge cutoff.</w:t>
       </w:r>
     </w:p>
@@ -8498,7 +8513,7 @@
                 <w:color w:val="444A54"/>
                 <w:sz w:val="18"/>
               </w:rPr>
-              <w:t>K5  |  20 min  |  slide 54</w:t>
+              <w:t>K5  |  20 min  |  slide 58</w:t>
             </w:r>
           </w:p>
         </w:tc>
@@ -9055,7 +9070,7 @@
                 <w:color w:val="444A54"/>
                 <w:sz w:val="18"/>
               </w:rPr>
-              <w:t>A3, K5, K9  |  20 min  |  slide 55</w:t>
+              <w:t>A3, K5, K9  |  20 min  |  slide 59</w:t>
             </w:r>
           </w:p>
         </w:tc>
@@ -9612,7 +9627,7 @@
                 <w:color w:val="444A54"/>
                 <w:sz w:val="18"/>
               </w:rPr>
-              <w:t>A6, K9  |  20 min  |  slide 57</w:t>
+              <w:t>A6, K9  |  20 min  |  slide 61</w:t>
             </w:r>
           </w:p>
         </w:tc>
@@ -10169,7 +10184,7 @@
                 <w:color w:val="444A54"/>
                 <w:sz w:val="18"/>
               </w:rPr>
-              <w:t>A1, A6, K1  |  15 min  |  slide 60</w:t>
+              <w:t>A1, A6, K1  |  15 min  |  slide 64</w:t>
             </w:r>
           </w:p>
         </w:tc>
@@ -10633,7 +10648,7 @@
           <w:color w:val="E87122"/>
           <w:sz w:val="19"/>
         </w:rPr>
-        <w:t>Day 1  |  Slides 63-97  |  A2, A3, K3, K5, K7  |  Labs 5-9</w:t>
+        <w:t>Day 1  |  Slides 67-104  |  A2, A3, K3, K5, K7  |  Labs 5-9</w:t>
       </w:r>
     </w:p>
     <w:p>
@@ -10931,7 +10946,7 @@
                 <w:color w:val="444A54"/>
                 <w:sz w:val="18"/>
               </w:rPr>
-              <w:t>A3, K3, K7  |  25 min  |  slide 86</w:t>
+              <w:t>A3, K3, K7  |  25 min  |  slide 93</w:t>
             </w:r>
           </w:p>
         </w:tc>
@@ -11488,7 +11503,7 @@
                 <w:color w:val="444A54"/>
                 <w:sz w:val="18"/>
               </w:rPr>
-              <w:t>A2, A3, K3, K7  |  30 min  |  slide 88</w:t>
+              <w:t>A2, A3, K3, K7  |  30 min  |  slide 95</w:t>
             </w:r>
           </w:p>
         </w:tc>
@@ -12075,7 +12090,7 @@
                 <w:color w:val="444A54"/>
                 <w:sz w:val="18"/>
               </w:rPr>
-              <w:t>A2, K3, K7  |  25 min  |  slide 91</w:t>
+              <w:t>A2, K3, K7  |  25 min  |  slide 98</w:t>
             </w:r>
           </w:p>
         </w:tc>
@@ -12632,7 +12647,7 @@
                 <w:color w:val="444A54"/>
                 <w:sz w:val="18"/>
               </w:rPr>
-              <w:t>A3, K5  |  30 min  |  slide 93</w:t>
+              <w:t>A3, K5  |  30 min  |  slide 100</w:t>
             </w:r>
           </w:p>
         </w:tc>
@@ -13219,7 +13234,7 @@
                 <w:color w:val="444A54"/>
                 <w:sz w:val="18"/>
               </w:rPr>
-              <w:t>A3, K3  |  25 min  |  slide 94</w:t>
+              <w:t>A3, K3  |  25 min  |  slide 101</w:t>
             </w:r>
           </w:p>
         </w:tc>
@@ -13653,7 +13668,7 @@
           <w:color w:val="E87122"/>
           <w:sz w:val="19"/>
         </w:rPr>
-        <w:t>Day 2  |  Slides 98-126  |  A4, A5, K2, K4, K6  |  Labs 10-14</w:t>
+        <w:t>Day 2  |  Slides 105-133  |  A4, A5, K2, K4, K6  |  Labs 10-14</w:t>
       </w:r>
     </w:p>
     <w:p>
@@ -13966,7 +13981,7 @@
                 <w:color w:val="444A54"/>
                 <w:sz w:val="18"/>
               </w:rPr>
-              <w:t>A2, A4, K2  |  20 min  |  slide 116</w:t>
+              <w:t>A2, A4, K2  |  20 min  |  slide 123</w:t>
             </w:r>
           </w:p>
         </w:tc>
@@ -14493,7 +14508,7 @@
                 <w:color w:val="444A54"/>
                 <w:sz w:val="18"/>
               </w:rPr>
-              <w:t>A4, K4, K6  |  20 min  |  slide 118</w:t>
+              <w:t>A4, K4, K6  |  20 min  |  slide 125</w:t>
             </w:r>
           </w:p>
         </w:tc>
@@ -15035,7 +15050,7 @@
                 <w:color w:val="444A54"/>
                 <w:sz w:val="18"/>
               </w:rPr>
-              <w:t>A4, K4, K6  |  15 min  |  slide 120</w:t>
+              <w:t>A4, K4, K6  |  15 min  |  slide 127</w:t>
             </w:r>
           </w:p>
         </w:tc>
@@ -15562,7 +15577,7 @@
                 <w:color w:val="444A54"/>
                 <w:sz w:val="18"/>
               </w:rPr>
-              <w:t>A5, K2  |  15 min  |  slide 122</w:t>
+              <w:t>A5, K2  |  15 min  |  slide 129</w:t>
             </w:r>
           </w:p>
         </w:tc>
@@ -16089,7 +16104,7 @@
                 <w:color w:val="444A54"/>
                 <w:sz w:val="18"/>
               </w:rPr>
-              <w:t>A4, K6  |  20 min  |  slide 124</w:t>
+              <w:t>A4, K6  |  20 min  |  slide 131</w:t>
             </w:r>
           </w:p>
         </w:tc>
@@ -16538,7 +16553,7 @@
           <w:color w:val="E87122"/>
           <w:sz w:val="19"/>
         </w:rPr>
-        <w:t>Day 2  |  Slides 127-148  |  A7, A8, A9, A10, K7, K8  |  Labs 15-20</w:t>
+        <w:t>Day 2  |  Slides 134-155  |  A7, A8, A9, A10, K7, K8  |  Labs 15-20</w:t>
       </w:r>
     </w:p>
     <w:p>
@@ -16836,7 +16851,7 @@
                 <w:color w:val="444A54"/>
                 <w:sz w:val="18"/>
               </w:rPr>
-              <w:t>A7, A8, K7  |  25 min  |  slide 137</w:t>
+              <w:t>A7, A8, K7  |  25 min  |  slide 144</w:t>
             </w:r>
           </w:p>
         </w:tc>
@@ -17363,7 +17378,7 @@
                 <w:color w:val="444A54"/>
                 <w:sz w:val="18"/>
               </w:rPr>
-              <w:t>A7, A8, K7  |  25 min  |  slide 139</w:t>
+              <w:t>A7, A8, K7  |  25 min  |  slide 146</w:t>
             </w:r>
           </w:p>
         </w:tc>
@@ -17935,7 +17950,7 @@
                 <w:color w:val="444A54"/>
                 <w:sz w:val="18"/>
               </w:rPr>
-              <w:t>A7, K5, K7  |  20 min  |  slide 141</w:t>
+              <w:t>A7, K5, K7  |  20 min  |  slide 148</w:t>
             </w:r>
           </w:p>
         </w:tc>
@@ -18507,7 +18522,7 @@
                 <w:color w:val="444A54"/>
                 <w:sz w:val="18"/>
               </w:rPr>
-              <w:t>A9, K8  |  20 min  |  slide 142</w:t>
+              <w:t>A9, K8  |  20 min  |  slide 149</w:t>
             </w:r>
           </w:p>
         </w:tc>
@@ -19049,7 +19064,7 @@
                 <w:color w:val="444A54"/>
                 <w:sz w:val="18"/>
               </w:rPr>
-              <w:t>A8, A10  |  25 min  |  slide 144</w:t>
+              <w:t>A8, A10  |  25 min  |  slide 151</w:t>
             </w:r>
           </w:p>
         </w:tc>
@@ -19591,7 +19606,7 @@
                 <w:color w:val="444A54"/>
                 <w:sz w:val="18"/>
               </w:rPr>
-              <w:t>A7, A10, K1  |  20 min  |  slide 146</w:t>
+              <w:t>A7, A10, K1  |  20 min  |  slide 153</w:t>
             </w:r>
           </w:p>
         </w:tc>

</xml_diff>

<commit_message>
Courseware: TMS login and download slides at the front of the deck; LG OTP download steps
Co-Authored-By: Claude Opus 5.5 <noreply@anthropic.com>
</commit_message>
<xml_diff>
--- a/courseware/Facilitator-Guide_ML 101 for Financial Trading_v2.0.docx
+++ b/courseware/Facilitator-Guide_ML 101 for Financial Trading_v2.0.docx
@@ -2380,7 +2380,7 @@
                 <w:color w:val="444A54"/>
                 <w:sz w:val="17"/>
               </w:rPr>
-              <w:t>1-27</w:t>
+              <w:t>1-29</w:t>
             </w:r>
           </w:p>
         </w:tc>
@@ -2510,7 +2510,7 @@
                 <w:color w:val="444A54"/>
                 <w:sz w:val="17"/>
               </w:rPr>
-              <w:t>29-57</w:t>
+              <w:t>31-59</w:t>
             </w:r>
           </w:p>
         </w:tc>
@@ -2772,7 +2772,7 @@
                 <w:color w:val="444A54"/>
                 <w:sz w:val="17"/>
               </w:rPr>
-              <w:t>29-57</w:t>
+              <w:t>31-59</w:t>
             </w:r>
           </w:p>
         </w:tc>
@@ -2908,7 +2908,7 @@
                 <w:color w:val="444A54"/>
                 <w:sz w:val="17"/>
               </w:rPr>
-              <w:t>58</w:t>
+              <w:t>60</w:t>
             </w:r>
           </w:p>
         </w:tc>
@@ -3038,7 +3038,7 @@
                 <w:color w:val="444A54"/>
                 <w:sz w:val="17"/>
               </w:rPr>
-              <w:t>59</w:t>
+              <w:t>61</w:t>
             </w:r>
           </w:p>
         </w:tc>
@@ -3174,7 +3174,7 @@
                 <w:color w:val="444A54"/>
                 <w:sz w:val="17"/>
               </w:rPr>
-              <w:t>61</w:t>
+              <w:t>63</w:t>
             </w:r>
           </w:p>
         </w:tc>
@@ -3436,7 +3436,7 @@
                 <w:color w:val="444A54"/>
                 <w:sz w:val="17"/>
               </w:rPr>
-              <w:t>64</w:t>
+              <w:t>66</w:t>
             </w:r>
           </w:p>
         </w:tc>
@@ -3566,7 +3566,7 @@
                 <w:color w:val="444A54"/>
                 <w:sz w:val="17"/>
               </w:rPr>
-              <w:t>68-92</w:t>
+              <w:t>70-94</w:t>
             </w:r>
           </w:p>
         </w:tc>
@@ -3702,7 +3702,7 @@
                 <w:color w:val="444A54"/>
                 <w:sz w:val="17"/>
               </w:rPr>
-              <w:t>93</w:t>
+              <w:t>95</w:t>
             </w:r>
           </w:p>
         </w:tc>
@@ -3832,7 +3832,7 @@
                 <w:color w:val="444A54"/>
                 <w:sz w:val="17"/>
               </w:rPr>
-              <w:t>95</w:t>
+              <w:t>97</w:t>
             </w:r>
           </w:p>
         </w:tc>
@@ -4094,7 +4094,7 @@
                 <w:color w:val="444A54"/>
                 <w:sz w:val="17"/>
               </w:rPr>
-              <w:t>98</w:t>
+              <w:t>100</w:t>
             </w:r>
           </w:p>
         </w:tc>
@@ -4230,7 +4230,7 @@
                 <w:color w:val="444A54"/>
                 <w:sz w:val="17"/>
               </w:rPr>
-              <w:t>68-92</w:t>
+              <w:t>70-94</w:t>
             </w:r>
           </w:p>
         </w:tc>
@@ -4360,7 +4360,7 @@
                 <w:color w:val="444A54"/>
                 <w:sz w:val="17"/>
               </w:rPr>
-              <w:t>100</w:t>
+              <w:t>102</w:t>
             </w:r>
           </w:p>
         </w:tc>
@@ -4496,7 +4496,7 @@
                 <w:color w:val="444A54"/>
                 <w:sz w:val="17"/>
               </w:rPr>
-              <w:t>68-92</w:t>
+              <w:t>70-94</w:t>
             </w:r>
           </w:p>
         </w:tc>
@@ -4626,7 +4626,7 @@
                 <w:color w:val="444A54"/>
                 <w:sz w:val="17"/>
               </w:rPr>
-              <w:t>101</w:t>
+              <w:t>103</w:t>
             </w:r>
           </w:p>
         </w:tc>
@@ -5077,7 +5077,7 @@
                 <w:color w:val="444A54"/>
                 <w:sz w:val="17"/>
               </w:rPr>
-              <w:t>1-27</w:t>
+              <w:t>1-29</w:t>
             </w:r>
           </w:p>
         </w:tc>
@@ -5207,7 +5207,7 @@
                 <w:color w:val="444A54"/>
                 <w:sz w:val="17"/>
               </w:rPr>
-              <w:t>106-122</w:t>
+              <w:t>108-124</w:t>
             </w:r>
           </w:p>
         </w:tc>
@@ -5343,7 +5343,7 @@
                 <w:color w:val="444A54"/>
                 <w:sz w:val="17"/>
               </w:rPr>
-              <w:t>123</w:t>
+              <w:t>125</w:t>
             </w:r>
           </w:p>
         </w:tc>
@@ -5473,7 +5473,7 @@
                 <w:color w:val="444A54"/>
                 <w:sz w:val="17"/>
               </w:rPr>
-              <w:t>125</w:t>
+              <w:t>127</w:t>
             </w:r>
           </w:p>
         </w:tc>
@@ -5735,7 +5735,7 @@
                 <w:color w:val="444A54"/>
                 <w:sz w:val="17"/>
               </w:rPr>
-              <w:t>106-122</w:t>
+              <w:t>108-124</w:t>
             </w:r>
           </w:p>
         </w:tc>
@@ -5871,7 +5871,7 @@
                 <w:color w:val="444A54"/>
                 <w:sz w:val="17"/>
               </w:rPr>
-              <w:t>127</w:t>
+              <w:t>129</w:t>
             </w:r>
           </w:p>
         </w:tc>
@@ -6001,7 +6001,7 @@
                 <w:color w:val="444A54"/>
                 <w:sz w:val="17"/>
               </w:rPr>
-              <w:t>106-122</w:t>
+              <w:t>108-124</w:t>
             </w:r>
           </w:p>
         </w:tc>
@@ -6137,7 +6137,7 @@
                 <w:color w:val="444A54"/>
                 <w:sz w:val="17"/>
               </w:rPr>
-              <w:t>129</w:t>
+              <w:t>131</w:t>
             </w:r>
           </w:p>
         </w:tc>
@@ -6267,7 +6267,7 @@
                 <w:color w:val="444A54"/>
                 <w:sz w:val="17"/>
               </w:rPr>
-              <w:t>131</w:t>
+              <w:t>133</w:t>
             </w:r>
           </w:p>
         </w:tc>
@@ -6403,7 +6403,7 @@
                 <w:color w:val="444A54"/>
                 <w:sz w:val="17"/>
               </w:rPr>
-              <w:t>135-142</w:t>
+              <w:t>137-144</w:t>
             </w:r>
           </w:p>
         </w:tc>
@@ -6665,7 +6665,7 @@
                 <w:color w:val="444A54"/>
                 <w:sz w:val="17"/>
               </w:rPr>
-              <w:t>144</w:t>
+              <w:t>146</w:t>
             </w:r>
           </w:p>
         </w:tc>
@@ -6795,7 +6795,7 @@
                 <w:color w:val="444A54"/>
                 <w:sz w:val="17"/>
               </w:rPr>
-              <w:t>135-142</w:t>
+              <w:t>137-144</w:t>
             </w:r>
           </w:p>
         </w:tc>
@@ -6931,7 +6931,7 @@
                 <w:color w:val="444A54"/>
                 <w:sz w:val="17"/>
               </w:rPr>
-              <w:t>146</w:t>
+              <w:t>148</w:t>
             </w:r>
           </w:p>
         </w:tc>
@@ -7061,7 +7061,7 @@
                 <w:color w:val="444A54"/>
                 <w:sz w:val="17"/>
               </w:rPr>
-              <w:t>148</w:t>
+              <w:t>150</w:t>
             </w:r>
           </w:p>
         </w:tc>
@@ -7197,7 +7197,7 @@
                 <w:color w:val="444A54"/>
                 <w:sz w:val="17"/>
               </w:rPr>
-              <w:t>135-142</w:t>
+              <w:t>137-144</w:t>
             </w:r>
           </w:p>
         </w:tc>
@@ -7327,7 +7327,7 @@
                 <w:color w:val="444A54"/>
                 <w:sz w:val="17"/>
               </w:rPr>
-              <w:t>149</w:t>
+              <w:t>151</w:t>
             </w:r>
           </w:p>
         </w:tc>
@@ -7589,7 +7589,7 @@
                 <w:color w:val="444A54"/>
                 <w:sz w:val="17"/>
               </w:rPr>
-              <w:t>135-142</w:t>
+              <w:t>137-144</w:t>
             </w:r>
           </w:p>
         </w:tc>
@@ -7725,7 +7725,7 @@
                 <w:color w:val="444A54"/>
                 <w:sz w:val="17"/>
               </w:rPr>
-              <w:t>151</w:t>
+              <w:t>153</w:t>
             </w:r>
           </w:p>
         </w:tc>
@@ -7855,7 +7855,7 @@
                 <w:color w:val="444A54"/>
                 <w:sz w:val="17"/>
               </w:rPr>
-              <w:t>153</w:t>
+              <w:t>155</w:t>
             </w:r>
           </w:p>
         </w:tc>
@@ -7991,7 +7991,7 @@
                 <w:color w:val="444A54"/>
                 <w:sz w:val="17"/>
               </w:rPr>
-              <w:t>20</w:t>
+              <w:t>23</w:t>
             </w:r>
           </w:p>
         </w:tc>
@@ -8121,7 +8121,7 @@
                 <w:color w:val="444A54"/>
                 <w:sz w:val="17"/>
               </w:rPr>
-              <w:t>20</w:t>
+              <w:t>23</w:t>
             </w:r>
           </w:p>
         </w:tc>
@@ -8185,7 +8185,7 @@
           <w:color w:val="E87122"/>
           <w:sz w:val="19"/>
         </w:rPr>
-        <w:t>Day 1  |  Slides 28-66  |  A1, A6, K1, K9  |  Labs 1-4</w:t>
+        <w:t>Day 1  |  Slides 30-68  |  A1, A6, K1, K9  |  Labs 1-4</w:t>
       </w:r>
     </w:p>
     <w:p>
@@ -8513,7 +8513,7 @@
                 <w:color w:val="444A54"/>
                 <w:sz w:val="18"/>
               </w:rPr>
-              <w:t>K5  |  20 min  |  slide 58</w:t>
+              <w:t>K5  |  20 min  |  slide 60</w:t>
             </w:r>
           </w:p>
         </w:tc>
@@ -9070,7 +9070,7 @@
                 <w:color w:val="444A54"/>
                 <w:sz w:val="18"/>
               </w:rPr>
-              <w:t>A3, K5, K9  |  20 min  |  slide 59</w:t>
+              <w:t>A3, K5, K9  |  20 min  |  slide 61</w:t>
             </w:r>
           </w:p>
         </w:tc>
@@ -9627,7 +9627,7 @@
                 <w:color w:val="444A54"/>
                 <w:sz w:val="18"/>
               </w:rPr>
-              <w:t>A6, K9  |  20 min  |  slide 61</w:t>
+              <w:t>A6, K9  |  20 min  |  slide 63</w:t>
             </w:r>
           </w:p>
         </w:tc>
@@ -10184,7 +10184,7 @@
                 <w:color w:val="444A54"/>
                 <w:sz w:val="18"/>
               </w:rPr>
-              <w:t>A1, A6, K1  |  15 min  |  slide 64</w:t>
+              <w:t>A1, A6, K1  |  15 min  |  slide 66</w:t>
             </w:r>
           </w:p>
         </w:tc>
@@ -10648,7 +10648,7 @@
           <w:color w:val="E87122"/>
           <w:sz w:val="19"/>
         </w:rPr>
-        <w:t>Day 1  |  Slides 67-104  |  A2, A3, K3, K5, K7  |  Labs 5-9</w:t>
+        <w:t>Day 1  |  Slides 69-106  |  A2, A3, K3, K5, K7  |  Labs 5-9</w:t>
       </w:r>
     </w:p>
     <w:p>
@@ -10946,7 +10946,7 @@
                 <w:color w:val="444A54"/>
                 <w:sz w:val="18"/>
               </w:rPr>
-              <w:t>A3, K3, K7  |  25 min  |  slide 93</w:t>
+              <w:t>A3, K3, K7  |  25 min  |  slide 95</w:t>
             </w:r>
           </w:p>
         </w:tc>
@@ -11503,7 +11503,7 @@
                 <w:color w:val="444A54"/>
                 <w:sz w:val="18"/>
               </w:rPr>
-              <w:t>A2, A3, K3, K7  |  30 min  |  slide 95</w:t>
+              <w:t>A2, A3, K3, K7  |  30 min  |  slide 97</w:t>
             </w:r>
           </w:p>
         </w:tc>
@@ -12090,7 +12090,7 @@
                 <w:color w:val="444A54"/>
                 <w:sz w:val="18"/>
               </w:rPr>
-              <w:t>A2, K3, K7  |  25 min  |  slide 98</w:t>
+              <w:t>A2, K3, K7  |  25 min  |  slide 100</w:t>
             </w:r>
           </w:p>
         </w:tc>
@@ -12647,7 +12647,7 @@
                 <w:color w:val="444A54"/>
                 <w:sz w:val="18"/>
               </w:rPr>
-              <w:t>A3, K5  |  30 min  |  slide 100</w:t>
+              <w:t>A3, K5  |  30 min  |  slide 102</w:t>
             </w:r>
           </w:p>
         </w:tc>
@@ -13234,7 +13234,7 @@
                 <w:color w:val="444A54"/>
                 <w:sz w:val="18"/>
               </w:rPr>
-              <w:t>A3, K3  |  25 min  |  slide 101</w:t>
+              <w:t>A3, K3  |  25 min  |  slide 103</w:t>
             </w:r>
           </w:p>
         </w:tc>
@@ -13668,7 +13668,7 @@
           <w:color w:val="E87122"/>
           <w:sz w:val="19"/>
         </w:rPr>
-        <w:t>Day 2  |  Slides 105-133  |  A4, A5, K2, K4, K6  |  Labs 10-14</w:t>
+        <w:t>Day 2  |  Slides 107-135  |  A4, A5, K2, K4, K6  |  Labs 10-14</w:t>
       </w:r>
     </w:p>
     <w:p>
@@ -13981,7 +13981,7 @@
                 <w:color w:val="444A54"/>
                 <w:sz w:val="18"/>
               </w:rPr>
-              <w:t>A2, A4, K2  |  20 min  |  slide 123</w:t>
+              <w:t>A2, A4, K2  |  20 min  |  slide 125</w:t>
             </w:r>
           </w:p>
         </w:tc>
@@ -14508,7 +14508,7 @@
                 <w:color w:val="444A54"/>
                 <w:sz w:val="18"/>
               </w:rPr>
-              <w:t>A4, K4, K6  |  20 min  |  slide 125</w:t>
+              <w:t>A4, K4, K6  |  20 min  |  slide 127</w:t>
             </w:r>
           </w:p>
         </w:tc>
@@ -15050,7 +15050,7 @@
                 <w:color w:val="444A54"/>
                 <w:sz w:val="18"/>
               </w:rPr>
-              <w:t>A4, K4, K6  |  15 min  |  slide 127</w:t>
+              <w:t>A4, K4, K6  |  15 min  |  slide 129</w:t>
             </w:r>
           </w:p>
         </w:tc>
@@ -15577,7 +15577,7 @@
                 <w:color w:val="444A54"/>
                 <w:sz w:val="18"/>
               </w:rPr>
-              <w:t>A5, K2  |  15 min  |  slide 129</w:t>
+              <w:t>A5, K2  |  15 min  |  slide 131</w:t>
             </w:r>
           </w:p>
         </w:tc>
@@ -16104,7 +16104,7 @@
                 <w:color w:val="444A54"/>
                 <w:sz w:val="18"/>
               </w:rPr>
-              <w:t>A4, K6  |  20 min  |  slide 131</w:t>
+              <w:t>A4, K6  |  20 min  |  slide 133</w:t>
             </w:r>
           </w:p>
         </w:tc>
@@ -16553,7 +16553,7 @@
           <w:color w:val="E87122"/>
           <w:sz w:val="19"/>
         </w:rPr>
-        <w:t>Day 2  |  Slides 134-155  |  A7, A8, A9, A10, K7, K8  |  Labs 15-20</w:t>
+        <w:t>Day 2  |  Slides 136-157  |  A7, A8, A9, A10, K7, K8  |  Labs 15-20</w:t>
       </w:r>
     </w:p>
     <w:p>
@@ -16851,7 +16851,7 @@
                 <w:color w:val="444A54"/>
                 <w:sz w:val="18"/>
               </w:rPr>
-              <w:t>A7, A8, K7  |  25 min  |  slide 144</w:t>
+              <w:t>A7, A8, K7  |  25 min  |  slide 146</w:t>
             </w:r>
           </w:p>
         </w:tc>
@@ -17378,7 +17378,7 @@
                 <w:color w:val="444A54"/>
                 <w:sz w:val="18"/>
               </w:rPr>
-              <w:t>A7, A8, K7  |  25 min  |  slide 146</w:t>
+              <w:t>A7, A8, K7  |  25 min  |  slide 148</w:t>
             </w:r>
           </w:p>
         </w:tc>
@@ -17950,7 +17950,7 @@
                 <w:color w:val="444A54"/>
                 <w:sz w:val="18"/>
               </w:rPr>
-              <w:t>A7, K5, K7  |  20 min  |  slide 148</w:t>
+              <w:t>A7, K5, K7  |  20 min  |  slide 150</w:t>
             </w:r>
           </w:p>
         </w:tc>
@@ -18522,7 +18522,7 @@
                 <w:color w:val="444A54"/>
                 <w:sz w:val="18"/>
               </w:rPr>
-              <w:t>A9, K8  |  20 min  |  slide 149</w:t>
+              <w:t>A9, K8  |  20 min  |  slide 151</w:t>
             </w:r>
           </w:p>
         </w:tc>
@@ -19064,7 +19064,7 @@
                 <w:color w:val="444A54"/>
                 <w:sz w:val="18"/>
               </w:rPr>
-              <w:t>A8, A10  |  25 min  |  slide 151</w:t>
+              <w:t>A8, A10  |  25 min  |  slide 153</w:t>
             </w:r>
           </w:p>
         </w:tc>
@@ -19606,7 +19606,7 @@
                 <w:color w:val="444A54"/>
                 <w:sz w:val="18"/>
               </w:rPr>
-              <w:t>A7, A10, K1  |  20 min  |  slide 153</w:t>
+              <w:t>A7, A10, K1  |  20 min  |  slide 155</w:t>
             </w:r>
           </w:p>
         </w:tc>

</xml_diff>

<commit_message>
Courseware: TOC and Version History each on their own page; TOC with page numbers
Co-Authored-By: Claude Opus 5.5 <noreply@anthropic.com>
</commit_message>
<xml_diff>
--- a/courseware/Facilitator-Guide_ML 101 for Financial Trading_v2.0.docx
+++ b/courseware/Facilitator-Guide_ML 101 for Financial Trading_v2.0.docx
@@ -153,493 +153,9 @@
       </w:r>
     </w:p>
     <w:p>
-      <w:bookmarkStart w:id="901" w:name="_Toc900"/>
       <w:pPr>
         <w:pStyle w:val="Heading1"/>
-      </w:pPr>
-      <w:r>
-        <w:t>Version History</w:t>
-      </w:r>
-      <w:bookmarkEnd w:id="901"/>
-    </w:p>
-    <w:tbl>
-      <w:tblPr>
-        <w:tblStyle w:val="TableGrid"/>
-        <w:tblW w:type="auto" w:w="0"/>
-        <w:jc w:val="center"/>
-        <w:tblLook w:firstColumn="1" w:firstRow="1" w:lastColumn="0" w:lastRow="0" w:noHBand="0" w:noVBand="1" w:val="04A0"/>
-        <w:tblLayout w:type="fixed"/>
-      </w:tblPr>
-      <w:tblGrid>
-        <w:gridCol w:w="1296"/>
-        <w:gridCol w:w="1728"/>
-        <w:gridCol w:w="5616"/>
-        <w:gridCol w:w="1584"/>
-      </w:tblGrid>
-      <w:tr>
-        <w:trPr>
-          <w:tblHeader w:val="true"/>
-        </w:trPr>
-        <w:tc>
-          <w:tcPr>
-            <w:tcW w:type="dxa" w:w="1296"/>
-            <w:shd w:val="clear" w:fill="1F3864"/>
-          </w:tcPr>
-          <w:p>
-            <w:pPr>
-              <w:keepNext/>
-              <w:spacing w:after="40" w:before="40" w:line="252" w:lineRule="auto"/>
-              <w:jc w:val="center"/>
-            </w:pPr>
-            <w:r/>
-            <w:r>
-              <w:rPr>
-                <w:rFonts w:ascii="Arial" w:hAnsi="Arial"/>
-                <w:b/>
-                <w:color w:val="FFFFFF"/>
-                <w:sz w:val="19"/>
-              </w:rPr>
-              <w:t>Version No</w:t>
-            </w:r>
-          </w:p>
-        </w:tc>
-        <w:tc>
-          <w:tcPr>
-            <w:tcW w:type="dxa" w:w="1728"/>
-            <w:shd w:val="clear" w:fill="1F3864"/>
-          </w:tcPr>
-          <w:p>
-            <w:pPr>
-              <w:keepNext/>
-              <w:spacing w:after="40" w:before="40" w:line="252" w:lineRule="auto"/>
-              <w:jc w:val="center"/>
-            </w:pPr>
-            <w:r/>
-            <w:r>
-              <w:rPr>
-                <w:rFonts w:ascii="Arial" w:hAnsi="Arial"/>
-                <w:b/>
-                <w:color w:val="FFFFFF"/>
-                <w:sz w:val="19"/>
-              </w:rPr>
-              <w:t>Date Effected</w:t>
-            </w:r>
-          </w:p>
-        </w:tc>
-        <w:tc>
-          <w:tcPr>
-            <w:tcW w:type="dxa" w:w="5616"/>
-            <w:shd w:val="clear" w:fill="1F3864"/>
-          </w:tcPr>
-          <w:p>
-            <w:pPr>
-              <w:keepNext/>
-              <w:spacing w:after="40" w:before="40" w:line="252" w:lineRule="auto"/>
-              <w:jc w:val="center"/>
-            </w:pPr>
-            <w:r/>
-            <w:r>
-              <w:rPr>
-                <w:rFonts w:ascii="Arial" w:hAnsi="Arial"/>
-                <w:b/>
-                <w:color w:val="FFFFFF"/>
-                <w:sz w:val="19"/>
-              </w:rPr>
-              <w:t>Change Update</w:t>
-            </w:r>
-          </w:p>
-        </w:tc>
-        <w:tc>
-          <w:tcPr>
-            <w:tcW w:type="dxa" w:w="1584"/>
-            <w:shd w:val="clear" w:fill="1F3864"/>
-          </w:tcPr>
-          <w:p>
-            <w:pPr>
-              <w:keepNext/>
-              <w:spacing w:after="40" w:before="40" w:line="252" w:lineRule="auto"/>
-              <w:jc w:val="center"/>
-            </w:pPr>
-            <w:r/>
-            <w:r>
-              <w:rPr>
-                <w:rFonts w:ascii="Arial" w:hAnsi="Arial"/>
-                <w:b/>
-                <w:color w:val="FFFFFF"/>
-                <w:sz w:val="19"/>
-              </w:rPr>
-              <w:t>Approved by</w:t>
-            </w:r>
-          </w:p>
-        </w:tc>
-      </w:tr>
-      <w:tr>
-        <w:trPr>
-          <w:cantSplit w:val="true"/>
-        </w:trPr>
-        <w:tc>
-          <w:tcPr>
-            <w:tcW w:type="dxa" w:w="1296"/>
-          </w:tcPr>
-          <w:p>
-            <w:pPr>
-              <w:keepNext/>
-              <w:spacing w:after="40" w:before="40" w:line="252" w:lineRule="auto"/>
-            </w:pPr>
-            <w:r/>
-            <w:r>
-              <w:rPr>
-                <w:rFonts w:ascii="Arial" w:hAnsi="Arial"/>
-                <w:b w:val="0"/>
-                <w:color w:val="444A54"/>
-                <w:sz w:val="19"/>
-              </w:rPr>
-              <w:t>2.0</w:t>
-            </w:r>
-          </w:p>
-        </w:tc>
-        <w:tc>
-          <w:tcPr>
-            <w:tcW w:type="dxa" w:w="1728"/>
-          </w:tcPr>
-          <w:p>
-            <w:pPr>
-              <w:keepNext/>
-              <w:spacing w:after="40" w:before="40" w:line="252" w:lineRule="auto"/>
-            </w:pPr>
-            <w:r/>
-            <w:r>
-              <w:rPr>
-                <w:rFonts w:ascii="Arial" w:hAnsi="Arial"/>
-                <w:b w:val="0"/>
-                <w:color w:val="444A54"/>
-                <w:sz w:val="19"/>
-              </w:rPr>
-              <w:t>18 October 2026</w:t>
-            </w:r>
-          </w:p>
-        </w:tc>
-        <w:tc>
-          <w:tcPr>
-            <w:tcW w:type="dxa" w:w="5616"/>
-          </w:tcPr>
-          <w:p>
-            <w:pPr>
-              <w:keepNext/>
-              <w:spacing w:after="40" w:before="40" w:line="252" w:lineRule="auto"/>
-            </w:pPr>
-            <w:r/>
-            <w:r>
-              <w:rPr>
-                <w:rFonts w:ascii="Arial" w:hAnsi="Arial"/>
-                <w:b w:val="0"/>
-                <w:color w:val="444A54"/>
-                <w:sz w:val="19"/>
-              </w:rPr>
-              <w:t>Major revision, focused entirely on quant and algorithmic stock trading. Courseware rebuilt on the single-source IBF pipeline and re-platformed to Alpaca (API-first broker, paper trading, 24/5 US stock trading) and TradingView (charting, Pine Script v6, Strategy Tester, Paper Trading) with Python. Four topics: quant success stories and the evolution of quant from Thorp and Renaissance through statistical arbitrage to high-frequency trading, the paradigm shift from machine learning to LLMs and its impact on quant, and AI agents versus agentic AI in trading; the classification of trading algorithms, indicators, strategies, a TradingView versus Alpaca comparison, order placement and metric definitions; machine learning models, statistical modelling, A/B testing and pairs trading as a hedging algorithm; and an end-to-end, automated algorithmic trading pipeline. 'How the algorithm works' slides explain each algorithm on real market data. Twenty hands-on labs build one pipeline stage by stage, each with an instruction PDF containing step-by-step AI prompts, and include live paper trading of a strategy. Assessment: Written Assessment (short-answer questions, K1-K9) and Practical Performance (four tasks, A1-A10) with a standalone SMART marking rubric. Facilitator Guide added. Fee restated in SGD exclusive of GST, optimum class size stated, provider name updated to Tertiary Infotech Academy Pte Ltd.</w:t>
-            </w:r>
-          </w:p>
-        </w:tc>
-        <w:tc>
-          <w:tcPr>
-            <w:tcW w:type="dxa" w:w="1584"/>
-          </w:tcPr>
-          <w:p>
-            <w:pPr>
-              <w:keepNext/>
-              <w:spacing w:after="40" w:before="40" w:line="252" w:lineRule="auto"/>
-            </w:pPr>
-            <w:r/>
-            <w:r>
-              <w:rPr>
-                <w:rFonts w:ascii="Arial" w:hAnsi="Arial"/>
-                <w:b w:val="0"/>
-                <w:color w:val="444A54"/>
-                <w:sz w:val="19"/>
-              </w:rPr>
-              <w:t>Dr Alfred Ang</w:t>
-            </w:r>
-          </w:p>
-        </w:tc>
-      </w:tr>
-      <w:tr>
-        <w:trPr>
-          <w:cantSplit w:val="true"/>
-        </w:trPr>
-        <w:tc>
-          <w:tcPr>
-            <w:tcW w:type="dxa" w:w="1296"/>
-          </w:tcPr>
-          <w:p>
-            <w:pPr>
-              <w:keepNext/>
-              <w:spacing w:after="40" w:before="40" w:line="252" w:lineRule="auto"/>
-            </w:pPr>
-            <w:r/>
-            <w:r>
-              <w:rPr>
-                <w:rFonts w:ascii="Arial" w:hAnsi="Arial"/>
-                <w:b w:val="0"/>
-                <w:color w:val="444A54"/>
-                <w:sz w:val="19"/>
-              </w:rPr>
-              <w:t>1.1</w:t>
-            </w:r>
-          </w:p>
-        </w:tc>
-        <w:tc>
-          <w:tcPr>
-            <w:tcW w:type="dxa" w:w="1728"/>
-          </w:tcPr>
-          <w:p>
-            <w:pPr>
-              <w:keepNext/>
-              <w:spacing w:after="40" w:before="40" w:line="252" w:lineRule="auto"/>
-            </w:pPr>
-            <w:r/>
-            <w:r>
-              <w:rPr>
-                <w:rFonts w:ascii="Arial" w:hAnsi="Arial"/>
-                <w:b w:val="0"/>
-                <w:color w:val="444A54"/>
-                <w:sz w:val="19"/>
-              </w:rPr>
-              <w:t>22 December 2022</w:t>
-            </w:r>
-          </w:p>
-        </w:tc>
-        <w:tc>
-          <w:tcPr>
-            <w:tcW w:type="dxa" w:w="5616"/>
-          </w:tcPr>
-          <w:p>
-            <w:pPr>
-              <w:keepNext/>
-              <w:spacing w:after="40" w:before="40" w:line="252" w:lineRule="auto"/>
-            </w:pPr>
-            <w:r/>
-            <w:r>
-              <w:rPr>
-                <w:rFonts w:ascii="Arial" w:hAnsi="Arial"/>
-                <w:b w:val="0"/>
-                <w:color w:val="444A54"/>
-                <w:sz w:val="19"/>
-              </w:rPr>
-              <w:t>Multiple choice questions removed; practical test retained as the sole assessment instrument.</w:t>
-            </w:r>
-          </w:p>
-        </w:tc>
-        <w:tc>
-          <w:tcPr>
-            <w:tcW w:type="dxa" w:w="1584"/>
-          </w:tcPr>
-          <w:p>
-            <w:pPr>
-              <w:keepNext/>
-              <w:spacing w:after="40" w:before="40" w:line="252" w:lineRule="auto"/>
-            </w:pPr>
-            <w:r/>
-            <w:r>
-              <w:rPr>
-                <w:rFonts w:ascii="Arial" w:hAnsi="Arial"/>
-                <w:b w:val="0"/>
-                <w:color w:val="444A54"/>
-                <w:sz w:val="19"/>
-              </w:rPr>
-              <w:t>Dr Alfred Ang</w:t>
-            </w:r>
-          </w:p>
-        </w:tc>
-      </w:tr>
-      <w:tr>
-        <w:trPr>
-          <w:cantSplit w:val="true"/>
-        </w:trPr>
-        <w:tc>
-          <w:tcPr>
-            <w:tcW w:type="dxa" w:w="1296"/>
-          </w:tcPr>
-          <w:p>
-            <w:pPr>
-              <w:keepNext/>
-              <w:spacing w:after="40" w:before="40" w:line="252" w:lineRule="auto"/>
-            </w:pPr>
-            <w:r/>
-            <w:r>
-              <w:rPr>
-                <w:rFonts w:ascii="Arial" w:hAnsi="Arial"/>
-                <w:b w:val="0"/>
-                <w:color w:val="444A54"/>
-                <w:sz w:val="19"/>
-              </w:rPr>
-              <w:t>1.0</w:t>
-            </w:r>
-          </w:p>
-        </w:tc>
-        <w:tc>
-          <w:tcPr>
-            <w:tcW w:type="dxa" w:w="1728"/>
-          </w:tcPr>
-          <w:p>
-            <w:pPr>
-              <w:keepNext/>
-              <w:spacing w:after="40" w:before="40" w:line="252" w:lineRule="auto"/>
-            </w:pPr>
-            <w:r/>
-            <w:r>
-              <w:rPr>
-                <w:rFonts w:ascii="Arial" w:hAnsi="Arial"/>
-                <w:b w:val="0"/>
-                <w:color w:val="444A54"/>
-                <w:sz w:val="19"/>
-              </w:rPr>
-              <w:t>10 June 2022</w:t>
-            </w:r>
-          </w:p>
-        </w:tc>
-        <w:tc>
-          <w:tcPr>
-            <w:tcW w:type="dxa" w:w="5616"/>
-          </w:tcPr>
-          <w:p>
-            <w:pPr>
-              <w:keepNext/>
-              <w:spacing w:after="40" w:before="40" w:line="252" w:lineRule="auto"/>
-            </w:pPr>
-            <w:r/>
-            <w:r>
-              <w:rPr>
-                <w:rFonts w:ascii="Arial" w:hAnsi="Arial"/>
-                <w:b w:val="0"/>
-                <w:color w:val="444A54"/>
-                <w:sz w:val="19"/>
-              </w:rPr>
-              <w:t>Initial release for pilot launch, aligned to Data Analytics and Computational Modelling (Proficiency Level 3).</w:t>
-            </w:r>
-          </w:p>
-        </w:tc>
-        <w:tc>
-          <w:tcPr>
-            <w:tcW w:type="dxa" w:w="1584"/>
-          </w:tcPr>
-          <w:p>
-            <w:pPr>
-              <w:keepNext/>
-              <w:spacing w:after="40" w:before="40" w:line="252" w:lineRule="auto"/>
-            </w:pPr>
-            <w:r/>
-            <w:r>
-              <w:rPr>
-                <w:rFonts w:ascii="Arial" w:hAnsi="Arial"/>
-                <w:b w:val="0"/>
-                <w:color w:val="444A54"/>
-                <w:sz w:val="19"/>
-              </w:rPr>
-              <w:t>Dr Alfred Ang</w:t>
-            </w:r>
-          </w:p>
-        </w:tc>
-      </w:tr>
-      <w:tr>
-        <w:trPr>
-          <w:cantSplit w:val="true"/>
-        </w:trPr>
-        <w:tc>
-          <w:tcPr>
-            <w:tcW w:type="dxa" w:w="1296"/>
-          </w:tcPr>
-          <w:p>
-            <w:pPr>
-              <w:spacing w:after="40" w:before="40" w:line="252" w:lineRule="auto"/>
-            </w:pPr>
-            <w:r/>
-            <w:r>
-              <w:rPr>
-                <w:rFonts w:ascii="Arial" w:hAnsi="Arial"/>
-                <w:b w:val="0"/>
-                <w:color w:val="444A54"/>
-                <w:sz w:val="19"/>
-              </w:rPr>
-            </w:r>
-          </w:p>
-        </w:tc>
-        <w:tc>
-          <w:tcPr>
-            <w:tcW w:type="dxa" w:w="1728"/>
-          </w:tcPr>
-          <w:p>
-            <w:pPr>
-              <w:spacing w:after="40" w:before="40" w:line="252" w:lineRule="auto"/>
-            </w:pPr>
-            <w:r/>
-            <w:r>
-              <w:rPr>
-                <w:rFonts w:ascii="Arial" w:hAnsi="Arial"/>
-                <w:b w:val="0"/>
-                <w:color w:val="444A54"/>
-                <w:sz w:val="19"/>
-              </w:rPr>
-            </w:r>
-          </w:p>
-        </w:tc>
-        <w:tc>
-          <w:tcPr>
-            <w:tcW w:type="dxa" w:w="5616"/>
-          </w:tcPr>
-          <w:p>
-            <w:pPr>
-              <w:spacing w:after="40" w:before="40" w:line="252" w:lineRule="auto"/>
-            </w:pPr>
-            <w:r/>
-            <w:r>
-              <w:rPr>
-                <w:rFonts w:ascii="Arial" w:hAnsi="Arial"/>
-                <w:b w:val="0"/>
-                <w:color w:val="444A54"/>
-                <w:sz w:val="19"/>
-              </w:rPr>
-            </w:r>
-          </w:p>
-        </w:tc>
-        <w:tc>
-          <w:tcPr>
-            <w:tcW w:type="dxa" w:w="1584"/>
-          </w:tcPr>
-          <w:p>
-            <w:pPr>
-              <w:spacing w:after="40" w:before="40" w:line="252" w:lineRule="auto"/>
-            </w:pPr>
-            <w:r/>
-            <w:r>
-              <w:rPr>
-                <w:rFonts w:ascii="Arial" w:hAnsi="Arial"/>
-                <w:b w:val="0"/>
-                <w:color w:val="444A54"/>
-                <w:sz w:val="19"/>
-              </w:rPr>
-            </w:r>
-          </w:p>
-        </w:tc>
-      </w:tr>
-    </w:tbl>
-    <w:p>
-      <w:pPr>
-        <w:spacing w:after="120"/>
-      </w:pPr>
-      <w:r>
-        <w:rPr>
-          <w:rFonts w:ascii="Arial" w:hAnsi="Arial"/>
-          <w:b w:val="0"/>
-          <w:i/>
-          <w:color w:val="444A54"/>
-          <w:sz w:val="19"/>
-        </w:rPr>
-        <w:t>This document is at Version 2.0, effective 18 October 2026.</w:t>
-      </w:r>
-    </w:p>
-    <w:p>
-      <w:pPr>
-        <w:pStyle w:val="Heading1"/>
+        <w:pageBreakBefore w:val="0"/>
       </w:pPr>
       <w:r>
         <w:t>Table of Contents</w:t>
@@ -671,6 +187,54 @@
           </w:rPr>
           <w:t xml:space="preserve">Version History</w:t>
         </w:r>
+        <w:r>
+          <w:tab/>
+        </w:r>
+        <w:r>
+          <w:rPr>
+            <w:rFonts w:ascii="Arial" w:hAnsi="Arial"/>
+            <w:sz w:val="21"/>
+            <w:b/>
+            <w:color w:val="1F3864"/>
+          </w:rPr>
+          <w:fldChar w:fldCharType="begin" w:dirty="true"/>
+        </w:r>
+        <w:r>
+          <w:rPr>
+            <w:rFonts w:ascii="Arial" w:hAnsi="Arial"/>
+            <w:sz w:val="21"/>
+            <w:b/>
+            <w:color w:val="1F3864"/>
+          </w:rPr>
+          <w:instrText xml:space="preserve"> PAGEREF _Toc900 \h </w:instrText>
+        </w:r>
+        <w:r>
+          <w:rPr>
+            <w:rFonts w:ascii="Arial" w:hAnsi="Arial"/>
+            <w:sz w:val="21"/>
+            <w:b/>
+            <w:color w:val="1F3864"/>
+          </w:rPr>
+          <w:fldChar w:fldCharType="separate"/>
+        </w:r>
+        <w:r>
+          <w:rPr>
+            <w:rFonts w:ascii="Arial" w:hAnsi="Arial"/>
+            <w:sz w:val="21"/>
+            <w:b/>
+            <w:color w:val="1F3864"/>
+          </w:rPr>
+          <w:t>1</w:t>
+        </w:r>
+        <w:r>
+          <w:rPr>
+            <w:rFonts w:ascii="Arial" w:hAnsi="Arial"/>
+            <w:sz w:val="21"/>
+            <w:b/>
+            <w:color w:val="1F3864"/>
+          </w:rPr>
+          <w:fldChar w:fldCharType="end"/>
+        </w:r>
       </w:hyperlink>
     </w:p>
     <w:p>
@@ -690,6 +254,54 @@
             <w:color w:val="1F3864"/>
           </w:rPr>
           <w:t xml:space="preserve">1.  About This Guide</w:t>
+        </w:r>
+        <w:r>
+          <w:tab/>
+        </w:r>
+        <w:r>
+          <w:rPr>
+            <w:rFonts w:ascii="Arial" w:hAnsi="Arial"/>
+            <w:sz w:val="21"/>
+            <w:b/>
+            <w:color w:val="1F3864"/>
+          </w:rPr>
+          <w:fldChar w:fldCharType="begin" w:dirty="true"/>
+        </w:r>
+        <w:r>
+          <w:rPr>
+            <w:rFonts w:ascii="Arial" w:hAnsi="Arial"/>
+            <w:sz w:val="21"/>
+            <w:b/>
+            <w:color w:val="1F3864"/>
+          </w:rPr>
+          <w:instrText xml:space="preserve"> PAGEREF _Toc901 \h </w:instrText>
+        </w:r>
+        <w:r>
+          <w:rPr>
+            <w:rFonts w:ascii="Arial" w:hAnsi="Arial"/>
+            <w:sz w:val="21"/>
+            <w:b/>
+            <w:color w:val="1F3864"/>
+          </w:rPr>
+          <w:fldChar w:fldCharType="separate"/>
+        </w:r>
+        <w:r>
+          <w:rPr>
+            <w:rFonts w:ascii="Arial" w:hAnsi="Arial"/>
+            <w:sz w:val="21"/>
+            <w:b/>
+            <w:color w:val="1F3864"/>
+          </w:rPr>
+          <w:t>1</w:t>
+        </w:r>
+        <w:r>
+          <w:rPr>
+            <w:rFonts w:ascii="Arial" w:hAnsi="Arial"/>
+            <w:sz w:val="21"/>
+            <w:b/>
+            <w:color w:val="1F3864"/>
+          </w:rPr>
+          <w:fldChar w:fldCharType="end"/>
         </w:r>
       </w:hyperlink>
     </w:p>
@@ -711,6 +323,54 @@
           </w:rPr>
           <w:t xml:space="preserve">2.  Preparing to Deliver</w:t>
         </w:r>
+        <w:r>
+          <w:tab/>
+        </w:r>
+        <w:r>
+          <w:rPr>
+            <w:rFonts w:ascii="Arial" w:hAnsi="Arial"/>
+            <w:sz w:val="21"/>
+            <w:b/>
+            <w:color w:val="1F3864"/>
+          </w:rPr>
+          <w:fldChar w:fldCharType="begin" w:dirty="true"/>
+        </w:r>
+        <w:r>
+          <w:rPr>
+            <w:rFonts w:ascii="Arial" w:hAnsi="Arial"/>
+            <w:sz w:val="21"/>
+            <w:b/>
+            <w:color w:val="1F3864"/>
+          </w:rPr>
+          <w:instrText xml:space="preserve"> PAGEREF _Toc902 \h </w:instrText>
+        </w:r>
+        <w:r>
+          <w:rPr>
+            <w:rFonts w:ascii="Arial" w:hAnsi="Arial"/>
+            <w:sz w:val="21"/>
+            <w:b/>
+            <w:color w:val="1F3864"/>
+          </w:rPr>
+          <w:fldChar w:fldCharType="separate"/>
+        </w:r>
+        <w:r>
+          <w:rPr>
+            <w:rFonts w:ascii="Arial" w:hAnsi="Arial"/>
+            <w:sz w:val="21"/>
+            <w:b/>
+            <w:color w:val="1F3864"/>
+          </w:rPr>
+          <w:t>1</w:t>
+        </w:r>
+        <w:r>
+          <w:rPr>
+            <w:rFonts w:ascii="Arial" w:hAnsi="Arial"/>
+            <w:sz w:val="21"/>
+            <w:b/>
+            <w:color w:val="1F3864"/>
+          </w:rPr>
+          <w:fldChar w:fldCharType="end"/>
+        </w:r>
       </w:hyperlink>
     </w:p>
     <w:p>
@@ -731,6 +391,54 @@
           </w:rPr>
           <w:t xml:space="preserve">3.  Daily Lesson Plan</w:t>
         </w:r>
+        <w:r>
+          <w:tab/>
+        </w:r>
+        <w:r>
+          <w:rPr>
+            <w:rFonts w:ascii="Arial" w:hAnsi="Arial"/>
+            <w:sz w:val="21"/>
+            <w:b/>
+            <w:color w:val="1F3864"/>
+          </w:rPr>
+          <w:fldChar w:fldCharType="begin" w:dirty="true"/>
+        </w:r>
+        <w:r>
+          <w:rPr>
+            <w:rFonts w:ascii="Arial" w:hAnsi="Arial"/>
+            <w:sz w:val="21"/>
+            <w:b/>
+            <w:color w:val="1F3864"/>
+          </w:rPr>
+          <w:instrText xml:space="preserve"> PAGEREF _Toc903 \h </w:instrText>
+        </w:r>
+        <w:r>
+          <w:rPr>
+            <w:rFonts w:ascii="Arial" w:hAnsi="Arial"/>
+            <w:sz w:val="21"/>
+            <w:b/>
+            <w:color w:val="1F3864"/>
+          </w:rPr>
+          <w:fldChar w:fldCharType="separate"/>
+        </w:r>
+        <w:r>
+          <w:rPr>
+            <w:rFonts w:ascii="Arial" w:hAnsi="Arial"/>
+            <w:sz w:val="21"/>
+            <w:b/>
+            <w:color w:val="1F3864"/>
+          </w:rPr>
+          <w:t>1</w:t>
+        </w:r>
+        <w:r>
+          <w:rPr>
+            <w:rFonts w:ascii="Arial" w:hAnsi="Arial"/>
+            <w:sz w:val="21"/>
+            <w:b/>
+            <w:color w:val="1F3864"/>
+          </w:rPr>
+          <w:fldChar w:fldCharType="end"/>
+        </w:r>
       </w:hyperlink>
     </w:p>
     <w:p>
@@ -750,6 +458,49 @@
           </w:rPr>
           <w:t xml:space="preserve">Day 1</w:t>
         </w:r>
+        <w:r>
+          <w:tab/>
+        </w:r>
+        <w:r>
+          <w:rPr>
+            <w:rFonts w:ascii="Arial" w:hAnsi="Arial"/>
+            <w:sz w:val="19"/>
+            <w:color w:val="444A54"/>
+          </w:rPr>
+          <w:fldChar w:fldCharType="begin" w:dirty="true"/>
+        </w:r>
+        <w:r>
+          <w:rPr>
+            <w:rFonts w:ascii="Arial" w:hAnsi="Arial"/>
+            <w:sz w:val="19"/>
+            <w:color w:val="444A54"/>
+          </w:rPr>
+          <w:instrText xml:space="preserve"> PAGEREF _Toc904 \h </w:instrText>
+        </w:r>
+        <w:r>
+          <w:rPr>
+            <w:rFonts w:ascii="Arial" w:hAnsi="Arial"/>
+            <w:sz w:val="19"/>
+            <w:color w:val="444A54"/>
+          </w:rPr>
+          <w:fldChar w:fldCharType="separate"/>
+        </w:r>
+        <w:r>
+          <w:rPr>
+            <w:rFonts w:ascii="Arial" w:hAnsi="Arial"/>
+            <w:sz w:val="19"/>
+            <w:color w:val="444A54"/>
+          </w:rPr>
+          <w:t>1</w:t>
+        </w:r>
+        <w:r>
+          <w:rPr>
+            <w:rFonts w:ascii="Arial" w:hAnsi="Arial"/>
+            <w:sz w:val="19"/>
+            <w:color w:val="444A54"/>
+          </w:rPr>
+          <w:fldChar w:fldCharType="end"/>
+        </w:r>
       </w:hyperlink>
     </w:p>
     <w:p>
@@ -768,6 +519,49 @@
             <w:color w:val="444A54"/>
           </w:rPr>
           <w:t xml:space="preserve">Day 2</w:t>
+        </w:r>
+        <w:r>
+          <w:tab/>
+        </w:r>
+        <w:r>
+          <w:rPr>
+            <w:rFonts w:ascii="Arial" w:hAnsi="Arial"/>
+            <w:sz w:val="19"/>
+            <w:color w:val="444A54"/>
+          </w:rPr>
+          <w:fldChar w:fldCharType="begin" w:dirty="true"/>
+        </w:r>
+        <w:r>
+          <w:rPr>
+            <w:rFonts w:ascii="Arial" w:hAnsi="Arial"/>
+            <w:sz w:val="19"/>
+            <w:color w:val="444A54"/>
+          </w:rPr>
+          <w:instrText xml:space="preserve"> PAGEREF _Toc905 \h </w:instrText>
+        </w:r>
+        <w:r>
+          <w:rPr>
+            <w:rFonts w:ascii="Arial" w:hAnsi="Arial"/>
+            <w:sz w:val="19"/>
+            <w:color w:val="444A54"/>
+          </w:rPr>
+          <w:fldChar w:fldCharType="separate"/>
+        </w:r>
+        <w:r>
+          <w:rPr>
+            <w:rFonts w:ascii="Arial" w:hAnsi="Arial"/>
+            <w:sz w:val="19"/>
+            <w:color w:val="444A54"/>
+          </w:rPr>
+          <w:t>1</w:t>
+        </w:r>
+        <w:r>
+          <w:rPr>
+            <w:rFonts w:ascii="Arial" w:hAnsi="Arial"/>
+            <w:sz w:val="19"/>
+            <w:color w:val="444A54"/>
+          </w:rPr>
+          <w:fldChar w:fldCharType="end"/>
         </w:r>
       </w:hyperlink>
     </w:p>
@@ -789,6 +583,54 @@
           </w:rPr>
           <w:t xml:space="preserve">4.  Facilitation Notes by Topic</w:t>
         </w:r>
+        <w:r>
+          <w:tab/>
+        </w:r>
+        <w:r>
+          <w:rPr>
+            <w:rFonts w:ascii="Arial" w:hAnsi="Arial"/>
+            <w:sz w:val="21"/>
+            <w:b/>
+            <w:color w:val="1F3864"/>
+          </w:rPr>
+          <w:fldChar w:fldCharType="begin" w:dirty="true"/>
+        </w:r>
+        <w:r>
+          <w:rPr>
+            <w:rFonts w:ascii="Arial" w:hAnsi="Arial"/>
+            <w:sz w:val="21"/>
+            <w:b/>
+            <w:color w:val="1F3864"/>
+          </w:rPr>
+          <w:instrText xml:space="preserve"> PAGEREF _Toc906 \h </w:instrText>
+        </w:r>
+        <w:r>
+          <w:rPr>
+            <w:rFonts w:ascii="Arial" w:hAnsi="Arial"/>
+            <w:sz w:val="21"/>
+            <w:b/>
+            <w:color w:val="1F3864"/>
+          </w:rPr>
+          <w:fldChar w:fldCharType="separate"/>
+        </w:r>
+        <w:r>
+          <w:rPr>
+            <w:rFonts w:ascii="Arial" w:hAnsi="Arial"/>
+            <w:sz w:val="21"/>
+            <w:b/>
+            <w:color w:val="1F3864"/>
+          </w:rPr>
+          <w:t>1</w:t>
+        </w:r>
+        <w:r>
+          <w:rPr>
+            <w:rFonts w:ascii="Arial" w:hAnsi="Arial"/>
+            <w:sz w:val="21"/>
+            <w:b/>
+            <w:color w:val="1F3864"/>
+          </w:rPr>
+          <w:fldChar w:fldCharType="end"/>
+        </w:r>
       </w:hyperlink>
     </w:p>
     <w:p>
@@ -807,6 +649,49 @@
             <w:color w:val="444A54"/>
           </w:rPr>
           <w:t xml:space="preserve">Topic 1: Foundations of Quant and Algorithmic Trading: From Thorp to AI Agents</w:t>
+        </w:r>
+        <w:r>
+          <w:tab/>
+        </w:r>
+        <w:r>
+          <w:rPr>
+            <w:rFonts w:ascii="Arial" w:hAnsi="Arial"/>
+            <w:sz w:val="19"/>
+            <w:color w:val="444A54"/>
+          </w:rPr>
+          <w:fldChar w:fldCharType="begin" w:dirty="true"/>
+        </w:r>
+        <w:r>
+          <w:rPr>
+            <w:rFonts w:ascii="Arial" w:hAnsi="Arial"/>
+            <w:sz w:val="19"/>
+            <w:color w:val="444A54"/>
+          </w:rPr>
+          <w:instrText xml:space="preserve"> PAGEREF _Toc907 \h </w:instrText>
+        </w:r>
+        <w:r>
+          <w:rPr>
+            <w:rFonts w:ascii="Arial" w:hAnsi="Arial"/>
+            <w:sz w:val="19"/>
+            <w:color w:val="444A54"/>
+          </w:rPr>
+          <w:fldChar w:fldCharType="separate"/>
+        </w:r>
+        <w:r>
+          <w:rPr>
+            <w:rFonts w:ascii="Arial" w:hAnsi="Arial"/>
+            <w:sz w:val="19"/>
+            <w:color w:val="444A54"/>
+          </w:rPr>
+          <w:t>1</w:t>
+        </w:r>
+        <w:r>
+          <w:rPr>
+            <w:rFonts w:ascii="Arial" w:hAnsi="Arial"/>
+            <w:sz w:val="19"/>
+            <w:color w:val="444A54"/>
+          </w:rPr>
+          <w:fldChar w:fldCharType="end"/>
         </w:r>
       </w:hyperlink>
     </w:p>
@@ -827,6 +712,49 @@
           </w:rPr>
           <w:t xml:space="preserve">Topic 2: Technical Indicators, Trading Strategies and Metrics with TradingView and Alpaca</w:t>
         </w:r>
+        <w:r>
+          <w:tab/>
+        </w:r>
+        <w:r>
+          <w:rPr>
+            <w:rFonts w:ascii="Arial" w:hAnsi="Arial"/>
+            <w:sz w:val="19"/>
+            <w:color w:val="444A54"/>
+          </w:rPr>
+          <w:fldChar w:fldCharType="begin" w:dirty="true"/>
+        </w:r>
+        <w:r>
+          <w:rPr>
+            <w:rFonts w:ascii="Arial" w:hAnsi="Arial"/>
+            <w:sz w:val="19"/>
+            <w:color w:val="444A54"/>
+          </w:rPr>
+          <w:instrText xml:space="preserve"> PAGEREF _Toc908 \h </w:instrText>
+        </w:r>
+        <w:r>
+          <w:rPr>
+            <w:rFonts w:ascii="Arial" w:hAnsi="Arial"/>
+            <w:sz w:val="19"/>
+            <w:color w:val="444A54"/>
+          </w:rPr>
+          <w:fldChar w:fldCharType="separate"/>
+        </w:r>
+        <w:r>
+          <w:rPr>
+            <w:rFonts w:ascii="Arial" w:hAnsi="Arial"/>
+            <w:sz w:val="19"/>
+            <w:color w:val="444A54"/>
+          </w:rPr>
+          <w:t>1</w:t>
+        </w:r>
+        <w:r>
+          <w:rPr>
+            <w:rFonts w:ascii="Arial" w:hAnsi="Arial"/>
+            <w:sz w:val="19"/>
+            <w:color w:val="444A54"/>
+          </w:rPr>
+          <w:fldChar w:fldCharType="end"/>
+        </w:r>
       </w:hyperlink>
     </w:p>
     <w:p>
@@ -846,6 +774,49 @@
           </w:rPr>
           <w:t xml:space="preserve">Topic 3: Machine Learning Models, Statistical Modelling and A/B Testing for Trading Signals</w:t>
         </w:r>
+        <w:r>
+          <w:tab/>
+        </w:r>
+        <w:r>
+          <w:rPr>
+            <w:rFonts w:ascii="Arial" w:hAnsi="Arial"/>
+            <w:sz w:val="19"/>
+            <w:color w:val="444A54"/>
+          </w:rPr>
+          <w:fldChar w:fldCharType="begin" w:dirty="true"/>
+        </w:r>
+        <w:r>
+          <w:rPr>
+            <w:rFonts w:ascii="Arial" w:hAnsi="Arial"/>
+            <w:sz w:val="19"/>
+            <w:color w:val="444A54"/>
+          </w:rPr>
+          <w:instrText xml:space="preserve"> PAGEREF _Toc909 \h </w:instrText>
+        </w:r>
+        <w:r>
+          <w:rPr>
+            <w:rFonts w:ascii="Arial" w:hAnsi="Arial"/>
+            <w:sz w:val="19"/>
+            <w:color w:val="444A54"/>
+          </w:rPr>
+          <w:fldChar w:fldCharType="separate"/>
+        </w:r>
+        <w:r>
+          <w:rPr>
+            <w:rFonts w:ascii="Arial" w:hAnsi="Arial"/>
+            <w:sz w:val="19"/>
+            <w:color w:val="444A54"/>
+          </w:rPr>
+          <w:t>1</w:t>
+        </w:r>
+        <w:r>
+          <w:rPr>
+            <w:rFonts w:ascii="Arial" w:hAnsi="Arial"/>
+            <w:sz w:val="19"/>
+            <w:color w:val="444A54"/>
+          </w:rPr>
+          <w:fldChar w:fldCharType="end"/>
+        </w:r>
       </w:hyperlink>
     </w:p>
     <w:p>
@@ -864,6 +835,49 @@
             <w:color w:val="444A54"/>
           </w:rPr>
           <w:t xml:space="preserve">Topic 4: Building an End-to-End Algorithmic Trading Pipeline: Backtest, Forward Test and Performance Analysis</w:t>
+        </w:r>
+        <w:r>
+          <w:tab/>
+        </w:r>
+        <w:r>
+          <w:rPr>
+            <w:rFonts w:ascii="Arial" w:hAnsi="Arial"/>
+            <w:sz w:val="19"/>
+            <w:color w:val="444A54"/>
+          </w:rPr>
+          <w:fldChar w:fldCharType="begin" w:dirty="true"/>
+        </w:r>
+        <w:r>
+          <w:rPr>
+            <w:rFonts w:ascii="Arial" w:hAnsi="Arial"/>
+            <w:sz w:val="19"/>
+            <w:color w:val="444A54"/>
+          </w:rPr>
+          <w:instrText xml:space="preserve"> PAGEREF _Toc910 \h </w:instrText>
+        </w:r>
+        <w:r>
+          <w:rPr>
+            <w:rFonts w:ascii="Arial" w:hAnsi="Arial"/>
+            <w:sz w:val="19"/>
+            <w:color w:val="444A54"/>
+          </w:rPr>
+          <w:fldChar w:fldCharType="separate"/>
+        </w:r>
+        <w:r>
+          <w:rPr>
+            <w:rFonts w:ascii="Arial" w:hAnsi="Arial"/>
+            <w:sz w:val="19"/>
+            <w:color w:val="444A54"/>
+          </w:rPr>
+          <w:t>1</w:t>
+        </w:r>
+        <w:r>
+          <w:rPr>
+            <w:rFonts w:ascii="Arial" w:hAnsi="Arial"/>
+            <w:sz w:val="19"/>
+            <w:color w:val="444A54"/>
+          </w:rPr>
+          <w:fldChar w:fldCharType="end"/>
         </w:r>
       </w:hyperlink>
     </w:p>
@@ -885,6 +899,54 @@
           </w:rPr>
           <w:t xml:space="preserve">5.  Assessment Administration</w:t>
         </w:r>
+        <w:r>
+          <w:tab/>
+        </w:r>
+        <w:r>
+          <w:rPr>
+            <w:rFonts w:ascii="Arial" w:hAnsi="Arial"/>
+            <w:sz w:val="21"/>
+            <w:b/>
+            <w:color w:val="1F3864"/>
+          </w:rPr>
+          <w:fldChar w:fldCharType="begin" w:dirty="true"/>
+        </w:r>
+        <w:r>
+          <w:rPr>
+            <w:rFonts w:ascii="Arial" w:hAnsi="Arial"/>
+            <w:sz w:val="21"/>
+            <w:b/>
+            <w:color w:val="1F3864"/>
+          </w:rPr>
+          <w:instrText xml:space="preserve"> PAGEREF _Toc911 \h </w:instrText>
+        </w:r>
+        <w:r>
+          <w:rPr>
+            <w:rFonts w:ascii="Arial" w:hAnsi="Arial"/>
+            <w:sz w:val="21"/>
+            <w:b/>
+            <w:color w:val="1F3864"/>
+          </w:rPr>
+          <w:fldChar w:fldCharType="separate"/>
+        </w:r>
+        <w:r>
+          <w:rPr>
+            <w:rFonts w:ascii="Arial" w:hAnsi="Arial"/>
+            <w:sz w:val="21"/>
+            <w:b/>
+            <w:color w:val="1F3864"/>
+          </w:rPr>
+          <w:t>1</w:t>
+        </w:r>
+        <w:r>
+          <w:rPr>
+            <w:rFonts w:ascii="Arial" w:hAnsi="Arial"/>
+            <w:sz w:val="21"/>
+            <w:b/>
+            <w:color w:val="1F3864"/>
+          </w:rPr>
+          <w:fldChar w:fldCharType="end"/>
+        </w:r>
       </w:hyperlink>
     </w:p>
     <w:p>
@@ -905,17 +967,547 @@
           </w:rPr>
           <w:t xml:space="preserve">6.  Assessor's Keys</w:t>
         </w:r>
+        <w:r>
+          <w:tab/>
+        </w:r>
+        <w:r>
+          <w:rPr>
+            <w:rFonts w:ascii="Arial" w:hAnsi="Arial"/>
+            <w:sz w:val="21"/>
+            <w:b/>
+            <w:color w:val="1F3864"/>
+          </w:rPr>
+          <w:fldChar w:fldCharType="begin" w:dirty="true"/>
+        </w:r>
+        <w:r>
+          <w:rPr>
+            <w:rFonts w:ascii="Arial" w:hAnsi="Arial"/>
+            <w:sz w:val="21"/>
+            <w:b/>
+            <w:color w:val="1F3864"/>
+          </w:rPr>
+          <w:instrText xml:space="preserve"> PAGEREF _Toc912 \h </w:instrText>
+        </w:r>
+        <w:r>
+          <w:rPr>
+            <w:rFonts w:ascii="Arial" w:hAnsi="Arial"/>
+            <w:sz w:val="21"/>
+            <w:b/>
+            <w:color w:val="1F3864"/>
+          </w:rPr>
+          <w:fldChar w:fldCharType="separate"/>
+        </w:r>
+        <w:r>
+          <w:rPr>
+            <w:rFonts w:ascii="Arial" w:hAnsi="Arial"/>
+            <w:sz w:val="21"/>
+            <w:b/>
+            <w:color w:val="1F3864"/>
+          </w:rPr>
+          <w:t>1</w:t>
+        </w:r>
+        <w:r>
+          <w:rPr>
+            <w:rFonts w:ascii="Arial" w:hAnsi="Arial"/>
+            <w:sz w:val="21"/>
+            <w:b/>
+            <w:color w:val="1F3864"/>
+          </w:rPr>
+          <w:fldChar w:fldCharType="end"/>
+        </w:r>
       </w:hyperlink>
     </w:p>
     <w:p>
+      <w:bookmarkStart w:id="901" w:name="_Toc900"/>
+      <w:pPr>
+        <w:pStyle w:val="Heading1"/>
+        <w:pageBreakBefore/>
+      </w:pPr>
       <w:r>
-        <w:br w:type="page"/>
+        <w:t>Version History</w:t>
+      </w:r>
+      <w:bookmarkEnd w:id="901"/>
+    </w:p>
+    <w:tbl>
+      <w:tblPr>
+        <w:tblStyle w:val="TableGrid"/>
+        <w:tblW w:type="auto" w:w="0"/>
+        <w:jc w:val="center"/>
+        <w:tblLook w:firstColumn="1" w:firstRow="1" w:lastColumn="0" w:lastRow="0" w:noHBand="0" w:noVBand="1" w:val="04A0"/>
+        <w:tblLayout w:type="fixed"/>
+      </w:tblPr>
+      <w:tblGrid>
+        <w:gridCol w:w="1296"/>
+        <w:gridCol w:w="1728"/>
+        <w:gridCol w:w="5616"/>
+        <w:gridCol w:w="1584"/>
+      </w:tblGrid>
+      <w:tr>
+        <w:trPr>
+          <w:tblHeader w:val="true"/>
+        </w:trPr>
+        <w:tc>
+          <w:tcPr>
+            <w:tcW w:type="dxa" w:w="1296"/>
+            <w:shd w:val="clear" w:fill="1F3864"/>
+          </w:tcPr>
+          <w:p>
+            <w:pPr>
+              <w:keepNext/>
+              <w:spacing w:after="40" w:before="40" w:line="252" w:lineRule="auto"/>
+              <w:jc w:val="center"/>
+            </w:pPr>
+            <w:r/>
+            <w:r>
+              <w:rPr>
+                <w:rFonts w:ascii="Arial" w:hAnsi="Arial"/>
+                <w:b/>
+                <w:color w:val="FFFFFF"/>
+                <w:sz w:val="19"/>
+              </w:rPr>
+              <w:t>Version No</w:t>
+            </w:r>
+          </w:p>
+        </w:tc>
+        <w:tc>
+          <w:tcPr>
+            <w:tcW w:type="dxa" w:w="1728"/>
+            <w:shd w:val="clear" w:fill="1F3864"/>
+          </w:tcPr>
+          <w:p>
+            <w:pPr>
+              <w:keepNext/>
+              <w:spacing w:after="40" w:before="40" w:line="252" w:lineRule="auto"/>
+              <w:jc w:val="center"/>
+            </w:pPr>
+            <w:r/>
+            <w:r>
+              <w:rPr>
+                <w:rFonts w:ascii="Arial" w:hAnsi="Arial"/>
+                <w:b/>
+                <w:color w:val="FFFFFF"/>
+                <w:sz w:val="19"/>
+              </w:rPr>
+              <w:t>Date Effected</w:t>
+            </w:r>
+          </w:p>
+        </w:tc>
+        <w:tc>
+          <w:tcPr>
+            <w:tcW w:type="dxa" w:w="5616"/>
+            <w:shd w:val="clear" w:fill="1F3864"/>
+          </w:tcPr>
+          <w:p>
+            <w:pPr>
+              <w:keepNext/>
+              <w:spacing w:after="40" w:before="40" w:line="252" w:lineRule="auto"/>
+              <w:jc w:val="center"/>
+            </w:pPr>
+            <w:r/>
+            <w:r>
+              <w:rPr>
+                <w:rFonts w:ascii="Arial" w:hAnsi="Arial"/>
+                <w:b/>
+                <w:color w:val="FFFFFF"/>
+                <w:sz w:val="19"/>
+              </w:rPr>
+              <w:t>Change Update</w:t>
+            </w:r>
+          </w:p>
+        </w:tc>
+        <w:tc>
+          <w:tcPr>
+            <w:tcW w:type="dxa" w:w="1584"/>
+            <w:shd w:val="clear" w:fill="1F3864"/>
+          </w:tcPr>
+          <w:p>
+            <w:pPr>
+              <w:keepNext/>
+              <w:spacing w:after="40" w:before="40" w:line="252" w:lineRule="auto"/>
+              <w:jc w:val="center"/>
+            </w:pPr>
+            <w:r/>
+            <w:r>
+              <w:rPr>
+                <w:rFonts w:ascii="Arial" w:hAnsi="Arial"/>
+                <w:b/>
+                <w:color w:val="FFFFFF"/>
+                <w:sz w:val="19"/>
+              </w:rPr>
+              <w:t>Approved by</w:t>
+            </w:r>
+          </w:p>
+        </w:tc>
+      </w:tr>
+      <w:tr>
+        <w:trPr>
+          <w:cantSplit w:val="true"/>
+        </w:trPr>
+        <w:tc>
+          <w:tcPr>
+            <w:tcW w:type="dxa" w:w="1296"/>
+          </w:tcPr>
+          <w:p>
+            <w:pPr>
+              <w:keepNext/>
+              <w:spacing w:after="40" w:before="40" w:line="252" w:lineRule="auto"/>
+            </w:pPr>
+            <w:r/>
+            <w:r>
+              <w:rPr>
+                <w:rFonts w:ascii="Arial" w:hAnsi="Arial"/>
+                <w:b w:val="0"/>
+                <w:color w:val="444A54"/>
+                <w:sz w:val="19"/>
+              </w:rPr>
+              <w:t>2.0</w:t>
+            </w:r>
+          </w:p>
+        </w:tc>
+        <w:tc>
+          <w:tcPr>
+            <w:tcW w:type="dxa" w:w="1728"/>
+          </w:tcPr>
+          <w:p>
+            <w:pPr>
+              <w:keepNext/>
+              <w:spacing w:after="40" w:before="40" w:line="252" w:lineRule="auto"/>
+            </w:pPr>
+            <w:r/>
+            <w:r>
+              <w:rPr>
+                <w:rFonts w:ascii="Arial" w:hAnsi="Arial"/>
+                <w:b w:val="0"/>
+                <w:color w:val="444A54"/>
+                <w:sz w:val="19"/>
+              </w:rPr>
+              <w:t>18 October 2026</w:t>
+            </w:r>
+          </w:p>
+        </w:tc>
+        <w:tc>
+          <w:tcPr>
+            <w:tcW w:type="dxa" w:w="5616"/>
+          </w:tcPr>
+          <w:p>
+            <w:pPr>
+              <w:keepNext/>
+              <w:spacing w:after="40" w:before="40" w:line="252" w:lineRule="auto"/>
+            </w:pPr>
+            <w:r/>
+            <w:r>
+              <w:rPr>
+                <w:rFonts w:ascii="Arial" w:hAnsi="Arial"/>
+                <w:b w:val="0"/>
+                <w:color w:val="444A54"/>
+                <w:sz w:val="19"/>
+              </w:rPr>
+              <w:t>Major revision, focused entirely on quant and algorithmic stock trading. Courseware rebuilt on the single-source IBF pipeline and re-platformed to Alpaca (API-first broker, paper trading, 24/5 US stock trading) and TradingView (charting, Pine Script v6, Strategy Tester, Paper Trading) with Python. Four topics: quant success stories and the evolution of quant from Thorp and Renaissance through statistical arbitrage to high-frequency trading, the paradigm shift from machine learning to LLMs and its impact on quant, and AI agents versus agentic AI in trading; the classification of trading algorithms, indicators, strategies, a TradingView versus Alpaca comparison, order placement and metric definitions; machine learning models, statistical modelling, A/B testing and pairs trading as a hedging algorithm; and an end-to-end, automated algorithmic trading pipeline. 'How the algorithm works' slides explain each algorithm on real market data. Twenty hands-on labs build one pipeline stage by stage, each with an instruction PDF containing step-by-step AI prompts, and include live paper trading of a strategy. Assessment: Written Assessment (short-answer questions, K1-K9) and Practical Performance (four tasks, A1-A10) with a standalone SMART marking rubric. Facilitator Guide added. Fee restated in SGD exclusive of GST, optimum class size stated, provider name updated to Tertiary Infotech Academy Pte Ltd.</w:t>
+            </w:r>
+          </w:p>
+        </w:tc>
+        <w:tc>
+          <w:tcPr>
+            <w:tcW w:type="dxa" w:w="1584"/>
+          </w:tcPr>
+          <w:p>
+            <w:pPr>
+              <w:keepNext/>
+              <w:spacing w:after="40" w:before="40" w:line="252" w:lineRule="auto"/>
+            </w:pPr>
+            <w:r/>
+            <w:r>
+              <w:rPr>
+                <w:rFonts w:ascii="Arial" w:hAnsi="Arial"/>
+                <w:b w:val="0"/>
+                <w:color w:val="444A54"/>
+                <w:sz w:val="19"/>
+              </w:rPr>
+              <w:t>Dr Alfred Ang</w:t>
+            </w:r>
+          </w:p>
+        </w:tc>
+      </w:tr>
+      <w:tr>
+        <w:trPr>
+          <w:cantSplit w:val="true"/>
+        </w:trPr>
+        <w:tc>
+          <w:tcPr>
+            <w:tcW w:type="dxa" w:w="1296"/>
+          </w:tcPr>
+          <w:p>
+            <w:pPr>
+              <w:keepNext/>
+              <w:spacing w:after="40" w:before="40" w:line="252" w:lineRule="auto"/>
+            </w:pPr>
+            <w:r/>
+            <w:r>
+              <w:rPr>
+                <w:rFonts w:ascii="Arial" w:hAnsi="Arial"/>
+                <w:b w:val="0"/>
+                <w:color w:val="444A54"/>
+                <w:sz w:val="19"/>
+              </w:rPr>
+              <w:t>1.1</w:t>
+            </w:r>
+          </w:p>
+        </w:tc>
+        <w:tc>
+          <w:tcPr>
+            <w:tcW w:type="dxa" w:w="1728"/>
+          </w:tcPr>
+          <w:p>
+            <w:pPr>
+              <w:keepNext/>
+              <w:spacing w:after="40" w:before="40" w:line="252" w:lineRule="auto"/>
+            </w:pPr>
+            <w:r/>
+            <w:r>
+              <w:rPr>
+                <w:rFonts w:ascii="Arial" w:hAnsi="Arial"/>
+                <w:b w:val="0"/>
+                <w:color w:val="444A54"/>
+                <w:sz w:val="19"/>
+              </w:rPr>
+              <w:t>22 December 2022</w:t>
+            </w:r>
+          </w:p>
+        </w:tc>
+        <w:tc>
+          <w:tcPr>
+            <w:tcW w:type="dxa" w:w="5616"/>
+          </w:tcPr>
+          <w:p>
+            <w:pPr>
+              <w:keepNext/>
+              <w:spacing w:after="40" w:before="40" w:line="252" w:lineRule="auto"/>
+            </w:pPr>
+            <w:r/>
+            <w:r>
+              <w:rPr>
+                <w:rFonts w:ascii="Arial" w:hAnsi="Arial"/>
+                <w:b w:val="0"/>
+                <w:color w:val="444A54"/>
+                <w:sz w:val="19"/>
+              </w:rPr>
+              <w:t>Multiple choice questions removed; practical test retained as the sole assessment instrument.</w:t>
+            </w:r>
+          </w:p>
+        </w:tc>
+        <w:tc>
+          <w:tcPr>
+            <w:tcW w:type="dxa" w:w="1584"/>
+          </w:tcPr>
+          <w:p>
+            <w:pPr>
+              <w:keepNext/>
+              <w:spacing w:after="40" w:before="40" w:line="252" w:lineRule="auto"/>
+            </w:pPr>
+            <w:r/>
+            <w:r>
+              <w:rPr>
+                <w:rFonts w:ascii="Arial" w:hAnsi="Arial"/>
+                <w:b w:val="0"/>
+                <w:color w:val="444A54"/>
+                <w:sz w:val="19"/>
+              </w:rPr>
+              <w:t>Dr Alfred Ang</w:t>
+            </w:r>
+          </w:p>
+        </w:tc>
+      </w:tr>
+      <w:tr>
+        <w:trPr>
+          <w:cantSplit w:val="true"/>
+        </w:trPr>
+        <w:tc>
+          <w:tcPr>
+            <w:tcW w:type="dxa" w:w="1296"/>
+          </w:tcPr>
+          <w:p>
+            <w:pPr>
+              <w:keepNext/>
+              <w:spacing w:after="40" w:before="40" w:line="252" w:lineRule="auto"/>
+            </w:pPr>
+            <w:r/>
+            <w:r>
+              <w:rPr>
+                <w:rFonts w:ascii="Arial" w:hAnsi="Arial"/>
+                <w:b w:val="0"/>
+                <w:color w:val="444A54"/>
+                <w:sz w:val="19"/>
+              </w:rPr>
+              <w:t>1.0</w:t>
+            </w:r>
+          </w:p>
+        </w:tc>
+        <w:tc>
+          <w:tcPr>
+            <w:tcW w:type="dxa" w:w="1728"/>
+          </w:tcPr>
+          <w:p>
+            <w:pPr>
+              <w:keepNext/>
+              <w:spacing w:after="40" w:before="40" w:line="252" w:lineRule="auto"/>
+            </w:pPr>
+            <w:r/>
+            <w:r>
+              <w:rPr>
+                <w:rFonts w:ascii="Arial" w:hAnsi="Arial"/>
+                <w:b w:val="0"/>
+                <w:color w:val="444A54"/>
+                <w:sz w:val="19"/>
+              </w:rPr>
+              <w:t>10 June 2022</w:t>
+            </w:r>
+          </w:p>
+        </w:tc>
+        <w:tc>
+          <w:tcPr>
+            <w:tcW w:type="dxa" w:w="5616"/>
+          </w:tcPr>
+          <w:p>
+            <w:pPr>
+              <w:keepNext/>
+              <w:spacing w:after="40" w:before="40" w:line="252" w:lineRule="auto"/>
+            </w:pPr>
+            <w:r/>
+            <w:r>
+              <w:rPr>
+                <w:rFonts w:ascii="Arial" w:hAnsi="Arial"/>
+                <w:b w:val="0"/>
+                <w:color w:val="444A54"/>
+                <w:sz w:val="19"/>
+              </w:rPr>
+              <w:t>Initial release for pilot launch, aligned to Data Analytics and Computational Modelling (Proficiency Level 3).</w:t>
+            </w:r>
+          </w:p>
+        </w:tc>
+        <w:tc>
+          <w:tcPr>
+            <w:tcW w:type="dxa" w:w="1584"/>
+          </w:tcPr>
+          <w:p>
+            <w:pPr>
+              <w:keepNext/>
+              <w:spacing w:after="40" w:before="40" w:line="252" w:lineRule="auto"/>
+            </w:pPr>
+            <w:r/>
+            <w:r>
+              <w:rPr>
+                <w:rFonts w:ascii="Arial" w:hAnsi="Arial"/>
+                <w:b w:val="0"/>
+                <w:color w:val="444A54"/>
+                <w:sz w:val="19"/>
+              </w:rPr>
+              <w:t>Dr Alfred Ang</w:t>
+            </w:r>
+          </w:p>
+        </w:tc>
+      </w:tr>
+      <w:tr>
+        <w:trPr>
+          <w:cantSplit w:val="true"/>
+        </w:trPr>
+        <w:tc>
+          <w:tcPr>
+            <w:tcW w:type="dxa" w:w="1296"/>
+          </w:tcPr>
+          <w:p>
+            <w:pPr>
+              <w:spacing w:after="40" w:before="40" w:line="252" w:lineRule="auto"/>
+            </w:pPr>
+            <w:r/>
+            <w:r>
+              <w:rPr>
+                <w:rFonts w:ascii="Arial" w:hAnsi="Arial"/>
+                <w:b w:val="0"/>
+                <w:color w:val="444A54"/>
+                <w:sz w:val="19"/>
+              </w:rPr>
+            </w:r>
+          </w:p>
+        </w:tc>
+        <w:tc>
+          <w:tcPr>
+            <w:tcW w:type="dxa" w:w="1728"/>
+          </w:tcPr>
+          <w:p>
+            <w:pPr>
+              <w:spacing w:after="40" w:before="40" w:line="252" w:lineRule="auto"/>
+            </w:pPr>
+            <w:r/>
+            <w:r>
+              <w:rPr>
+                <w:rFonts w:ascii="Arial" w:hAnsi="Arial"/>
+                <w:b w:val="0"/>
+                <w:color w:val="444A54"/>
+                <w:sz w:val="19"/>
+              </w:rPr>
+            </w:r>
+          </w:p>
+        </w:tc>
+        <w:tc>
+          <w:tcPr>
+            <w:tcW w:type="dxa" w:w="5616"/>
+          </w:tcPr>
+          <w:p>
+            <w:pPr>
+              <w:spacing w:after="40" w:before="40" w:line="252" w:lineRule="auto"/>
+            </w:pPr>
+            <w:r/>
+            <w:r>
+              <w:rPr>
+                <w:rFonts w:ascii="Arial" w:hAnsi="Arial"/>
+                <w:b w:val="0"/>
+                <w:color w:val="444A54"/>
+                <w:sz w:val="19"/>
+              </w:rPr>
+            </w:r>
+          </w:p>
+        </w:tc>
+        <w:tc>
+          <w:tcPr>
+            <w:tcW w:type="dxa" w:w="1584"/>
+          </w:tcPr>
+          <w:p>
+            <w:pPr>
+              <w:spacing w:after="40" w:before="40" w:line="252" w:lineRule="auto"/>
+            </w:pPr>
+            <w:r/>
+            <w:r>
+              <w:rPr>
+                <w:rFonts w:ascii="Arial" w:hAnsi="Arial"/>
+                <w:b w:val="0"/>
+                <w:color w:val="444A54"/>
+                <w:sz w:val="19"/>
+              </w:rPr>
+            </w:r>
+          </w:p>
+        </w:tc>
+      </w:tr>
+    </w:tbl>
+    <w:p>
+      <w:pPr>
+        <w:spacing w:after="120"/>
+      </w:pPr>
+      <w:r>
+        <w:rPr>
+          <w:rFonts w:ascii="Arial" w:hAnsi="Arial"/>
+          <w:b w:val="0"/>
+          <w:i/>
+          <w:color w:val="444A54"/>
+          <w:sz w:val="19"/>
+        </w:rPr>
+        <w:t>This document is at Version 2.0, effective 18 October 2026.</w:t>
       </w:r>
     </w:p>
     <w:p>
       <w:bookmarkStart w:id="902" w:name="_Toc901"/>
       <w:pPr>
         <w:pStyle w:val="Heading1"/>
+        <w:pageBreakBefore/>
       </w:pPr>
       <w:r>
         <w:t>1.  About This Guide</w:t>

</xml_diff>

<commit_message>
Courseware: exact slide citations per sub-section; larger simulator screenshots; Topic 1 schedule labels
Co-Authored-By: Claude Opus 5.5 <noreply@anthropic.com>
</commit_message>
<xml_diff>
--- a/courseware/Facilitator-Guide_ML 101 for Financial Trading_v2.0.docx
+++ b/courseware/Facilitator-Guide_ML 101 for Financial Trading_v2.0.docx
@@ -3039,7 +3039,7 @@
                 <w:color w:val="444A54"/>
                 <w:sz w:val="17"/>
               </w:rPr>
-              <w:t>T1.1-1.3 History of AI, AI Agents versus Agentic AI, and the History of Algorithmic Trading</w:t>
+              <w:t>T1.1-1.4 Quant Success Stories, the Evolution of Quant, the ML-to-LLM Shift, and Agentic AI versus AI Agents</w:t>
             </w:r>
           </w:p>
         </w:tc>
@@ -3102,7 +3102,7 @@
                 <w:color w:val="444A54"/>
                 <w:sz w:val="17"/>
               </w:rPr>
-              <w:t>31-59</w:t>
+              <w:t>31-53</w:t>
             </w:r>
           </w:p>
         </w:tc>
@@ -3301,7 +3301,7 @@
                 <w:color w:val="444A54"/>
                 <w:sz w:val="17"/>
               </w:rPr>
-              <w:t>T1.4-1.5 Forms of Financial Data, Big Data Applications and Trading Hypotheses</w:t>
+              <w:t>T1.5-1.6 Forms of Financial Data, Big Data Applications and Trading Hypotheses</w:t>
             </w:r>
           </w:p>
         </w:tc>
@@ -3364,7 +3364,7 @@
                 <w:color w:val="444A54"/>
                 <w:sz w:val="17"/>
               </w:rPr>
-              <w:t>31-59</w:t>
+              <w:t>54-59</w:t>
             </w:r>
           </w:p>
         </w:tc>
@@ -4158,7 +4158,7 @@
                 <w:color w:val="444A54"/>
                 <w:sz w:val="17"/>
               </w:rPr>
-              <w:t>71-95</w:t>
+              <w:t>71-73, 77-90</w:t>
             </w:r>
           </w:p>
         </w:tc>
@@ -4822,7 +4822,7 @@
                 <w:color w:val="444A54"/>
                 <w:sz w:val="17"/>
               </w:rPr>
-              <w:t>71-95</w:t>
+              <w:t>74-75, 91-95</w:t>
             </w:r>
           </w:p>
         </w:tc>
@@ -5088,7 +5088,7 @@
                 <w:color w:val="444A54"/>
                 <w:sz w:val="17"/>
               </w:rPr>
-              <w:t>71-95</w:t>
+              <w:t>76</w:t>
             </w:r>
           </w:p>
         </w:tc>
@@ -5799,7 +5799,7 @@
                 <w:color w:val="444A54"/>
                 <w:sz w:val="17"/>
               </w:rPr>
-              <w:t>110-126</w:t>
+              <w:t>110-112, 116-118, 123</w:t>
             </w:r>
           </w:p>
         </w:tc>
@@ -6327,7 +6327,7 @@
                 <w:color w:val="444A54"/>
                 <w:sz w:val="17"/>
               </w:rPr>
-              <w:t>110-126</w:t>
+              <w:t>113-114, 119-121</w:t>
             </w:r>
           </w:p>
         </w:tc>
@@ -6593,7 +6593,7 @@
                 <w:color w:val="444A54"/>
                 <w:sz w:val="17"/>
               </w:rPr>
-              <w:t>110-126</w:t>
+              <w:t>115, 122, 124-126</w:t>
             </w:r>
           </w:p>
         </w:tc>
@@ -6995,7 +6995,7 @@
                 <w:color w:val="444A54"/>
                 <w:sz w:val="17"/>
               </w:rPr>
-              <w:t>139-146</w:t>
+              <w:t>139-140, 143</w:t>
             </w:r>
           </w:p>
         </w:tc>
@@ -7387,7 +7387,7 @@
                 <w:color w:val="444A54"/>
                 <w:sz w:val="17"/>
               </w:rPr>
-              <w:t>139-146</w:t>
+              <w:t>144-145</w:t>
             </w:r>
           </w:p>
         </w:tc>
@@ -7789,7 +7789,7 @@
                 <w:color w:val="444A54"/>
                 <w:sz w:val="17"/>
               </w:rPr>
-              <w:t>139-146</w:t>
+              <w:t>141, 146</w:t>
             </w:r>
           </w:p>
         </w:tc>
@@ -8181,7 +8181,7 @@
                 <w:color w:val="444A54"/>
                 <w:sz w:val="17"/>
               </w:rPr>
-              <w:t>139-146</w:t>
+              <w:t>142</w:t>
             </w:r>
           </w:p>
         </w:tc>

</xml_diff>